<commit_message>
Add docs, models, MQL5 experts/indicators, Pine strategies; ignore nested .idea
Made-with: Cursor
</commit_message>
<xml_diff>
--- a/docs/PineScript_Backtester_Guide.docx
+++ b/docs/PineScript_Backtester_Guide.docx
@@ -8,10 +8,6 @@
         <w:jc w:val="center"/>
       </w:pPr>
       <w:r>
-        <w:rPr>
-          <w:color w:val="1B4FBE"/>
-          <w:sz w:val="52"/>
-        </w:rPr>
         <w:t>Rey Capital - PineScript Backtester</w:t>
       </w:r>
     </w:p>
@@ -21,126 +17,13 @@
       </w:pPr>
       <w:r>
         <w:rPr>
-          <w:color w:val="808080"/>
-          <w:sz w:val="22"/>
+          <w:color w:val="666666"/>
+          <w:sz w:val="28"/>
         </w:rPr>
-        <w:t>User Guide | Version 1.0 | March 28, 2026</w:t>
+        <w:t>User Guide &amp; Documentation</w:t>
       </w:r>
     </w:p>
-    <w:p>
-      <w:r>
-        <w:br w:type="page"/>
-      </w:r>
-    </w:p>
-    <w:p>
-      <w:pPr>
-        <w:pStyle w:val="Heading1"/>
-      </w:pPr>
-      <w:r>
-        <w:t>Table of Contents</w:t>
-      </w:r>
-    </w:p>
-    <w:p>
-      <w:pPr>
-        <w:spacing w:after="40"/>
-      </w:pPr>
-      <w:r>
-        <w:t>1. Overview</w:t>
-      </w:r>
-    </w:p>
-    <w:p>
-      <w:pPr>
-        <w:spacing w:after="40"/>
-      </w:pPr>
-      <w:r>
-        <w:t>2. Getting Started</w:t>
-      </w:r>
-    </w:p>
-    <w:p>
-      <w:pPr>
-        <w:spacing w:after="40"/>
-      </w:pPr>
-      <w:r>
-        <w:t>3. User Interface</w:t>
-      </w:r>
-    </w:p>
-    <w:p>
-      <w:pPr>
-        <w:spacing w:after="40"/>
-      </w:pPr>
-      <w:r>
-        <w:t>4. Running a Backtest</w:t>
-      </w:r>
-    </w:p>
-    <w:p>
-      <w:pPr>
-        <w:spacing w:after="40"/>
-      </w:pPr>
-      <w:r>
-        <w:t>5. Data Sources</w:t>
-      </w:r>
-    </w:p>
-    <w:p>
-      <w:pPr>
-        <w:spacing w:after="40"/>
-      </w:pPr>
-      <w:r>
-        <w:t>6. Supported PineScript Features</w:t>
-      </w:r>
-    </w:p>
-    <w:p>
-      <w:pPr>
-        <w:spacing w:after="40"/>
-      </w:pPr>
-      <w:r>
-        <w:t>7. Report Metrics</w:t>
-      </w:r>
-    </w:p>
-    <w:p>
-      <w:pPr>
-        <w:spacing w:after="40"/>
-      </w:pPr>
-      <w:r>
-        <w:t>8. Downloading Reports</w:t>
-      </w:r>
-    </w:p>
-    <w:p>
-      <w:pPr>
-        <w:spacing w:after="40"/>
-      </w:pPr>
-      <w:r>
-        <w:t>9. MT5 DataExporter Script</w:t>
-      </w:r>
-    </w:p>
-    <w:p>
-      <w:pPr>
-        <w:spacing w:after="40"/>
-      </w:pPr>
-      <w:r>
-        <w:t>10. API Endpoints</w:t>
-      </w:r>
-    </w:p>
-    <w:p>
-      <w:pPr>
-        <w:spacing w:after="40"/>
-      </w:pPr>
-      <w:r>
-        <w:t>11. Project Structure</w:t>
-      </w:r>
-    </w:p>
-    <w:p>
-      <w:pPr>
-        <w:spacing w:after="40"/>
-      </w:pPr>
-      <w:r>
-        <w:t>12. Troubleshooting</w:t>
-      </w:r>
-    </w:p>
-    <w:p>
-      <w:r>
-        <w:br w:type="page"/>
-      </w:r>
-    </w:p>
+    <w:p/>
     <w:p>
       <w:pPr>
         <w:pStyle w:val="Heading1"/>
@@ -151,7 +34,15 @@
     </w:p>
     <w:p>
       <w:r>
-        <w:t>The Rey Capital PineScript Backtester is a standalone web application for backtesting TradingView PineScript strategies over 5-10 years of historical data. It generates comprehensive MQL5-style reports with interactive charts, detailed metrics, and complete order/deal tables.</w:t>
+        <w:t>The PineScript Backtester is a web-based tool that lets you run TradingView PineScript v5 strategies over extended historical data (5-10+ years) and generates comprehensive MQL5-style backtest reports. TradingView's built-in strategy tester only covers ~4,000 candles, which is insufficient for validating strategy robustness across multiple market cycles. This tool solves that limitation.</w:t>
+      </w:r>
+    </w:p>
+    <w:p>
+      <w:pPr>
+        <w:pStyle w:val="Heading2"/>
+      </w:pPr>
+      <w:r>
+        <w:t>Key Features</w:t>
       </w:r>
     </w:p>
     <w:p>
@@ -159,7 +50,7 @@
         <w:pStyle w:val="ListBullet"/>
       </w:pPr>
       <w:r>
-        <w:t>Parse PineScript v5 strategy code and extract parameters automatically</w:t>
+        <w:t>PineScript v5 subset parser (strategy declarations, indicators, conditions, entries/exits)</w:t>
       </w:r>
     </w:p>
     <w:p>
@@ -167,7 +58,7 @@
         <w:pStyle w:val="ListBullet"/>
       </w:pPr>
       <w:r>
-        <w:t>Run bar-by-bar backtests with vectorized indicator computation</w:t>
+        <w:t>Bar-by-bar backtesting engine with stop-loss, take-profit, and slippage support</w:t>
       </w:r>
     </w:p>
     <w:p>
@@ -175,7 +66,7 @@
         <w:pStyle w:val="ListBullet"/>
       </w:pPr>
       <w:r>
-        <w:t>Generate 40+ MQL5-style metrics (Sharpe Ratio, Profit Factor, MFE/MAE, Z-Score, etc.)</w:t>
+        <w:t>40+ MQL5-style performance metrics (Sharpe, drawdown, profit factor, etc.)</w:t>
       </w:r>
     </w:p>
     <w:p>
@@ -191,7 +82,7 @@
         <w:pStyle w:val="ListBullet"/>
       </w:pPr>
       <w:r>
-        <w:t>Three data sources: Yahoo Finance, CSV upload, MT5 data export</w:t>
+        <w:t>Three data sources: Yahoo Finance, CSV upload, MT5 DataExporter</w:t>
       </w:r>
     </w:p>
     <w:p>
@@ -199,7 +90,7 @@
         <w:pStyle w:val="ListBullet"/>
       </w:pPr>
       <w:r>
-        <w:t>Light and Dark themes with Rey Capital branding</w:t>
+        <w:t>Order and deal tables matching MetaTrader 5 report format</w:t>
       </w:r>
     </w:p>
     <w:p>
@@ -207,7 +98,23 @@
         <w:pStyle w:val="ListBullet"/>
       </w:pPr>
       <w:r>
-        <w:t>Located at tools/backtester/, runs on port 8002</w:t>
+        <w:t>HTML and CSV report downloads</w:t>
+      </w:r>
+    </w:p>
+    <w:p>
+      <w:pPr>
+        <w:pStyle w:val="ListBullet"/>
+      </w:pPr>
+      <w:r>
+        <w:t>Light and dark theme support</w:t>
+      </w:r>
+    </w:p>
+    <w:p>
+      <w:pPr>
+        <w:pStyle w:val="ListBullet"/>
+      </w:pPr>
+      <w:r>
+        <w:t>Backtest history with re-viewable reports</w:t>
       </w:r>
     </w:p>
     <w:p>
@@ -215,15 +122,12 @@
         <w:pStyle w:val="Heading1"/>
       </w:pPr>
       <w:r>
-        <w:t>2. Getting Started</w:t>
+        <w:t>2. Prerequisites</w:t>
       </w:r>
     </w:p>
     <w:p>
-      <w:pPr>
-        <w:pStyle w:val="Heading2"/>
-      </w:pPr>
       <w:r>
-        <w:t>Prerequisites</w:t>
+        <w:t>Before running the backtester, ensure you have:</w:t>
       </w:r>
     </w:p>
     <w:p>
@@ -231,7 +135,7 @@
         <w:pStyle w:val="ListBullet"/>
       </w:pPr>
       <w:r>
-        <w:t>Python 3.10 or higher</w:t>
+        <w:t>Python 3.10 or higher installed</w:t>
       </w:r>
     </w:p>
     <w:p>
@@ -247,7 +151,23 @@
         <w:pStyle w:val="ListBullet"/>
       </w:pPr>
       <w:r>
-        <w:t>Internet connection (for Yahoo Finance data and fonts)</w:t>
+        <w:t>Internet connection (for Yahoo Finance data downloads)</w:t>
+      </w:r>
+    </w:p>
+    <w:p>
+      <w:pPr>
+        <w:pStyle w:val="ListBullet"/>
+      </w:pPr>
+      <w:r>
+        <w:t>A modern web browser (Chrome, Firefox, Edge)</w:t>
+      </w:r>
+    </w:p>
+    <w:p>
+      <w:pPr>
+        <w:pStyle w:val="Heading1"/>
+      </w:pPr>
+      <w:r>
+        <w:t>3. Installation &amp; Setup</w:t>
       </w:r>
     </w:p>
     <w:p>
@@ -255,44 +175,336 @@
         <w:pStyle w:val="Heading2"/>
       </w:pPr>
       <w:r>
-        <w:t>Installation</w:t>
+        <w:t>Step 1: Install Dependencies</w:t>
+      </w:r>
+    </w:p>
+    <w:p>
+      <w:r>
+        <w:t>Open a terminal and navigate to the backtester directory:</w:t>
       </w:r>
     </w:p>
     <w:p>
       <w:pPr>
-        <w:pStyle w:val="ListNumber"/>
+        <w:pStyle w:val="NoSpacing"/>
       </w:pPr>
       <w:r>
-        <w:t>Navigate to the backtester directory: cd tools/backtester</w:t>
+        <w:rPr>
+          <w:rFonts w:ascii="Consolas" w:hAnsi="Consolas"/>
+        </w:rPr>
+        <w:t>cd tools/backtester</w:t>
+      </w:r>
+    </w:p>
+    <w:p>
+      <w:r>
+        <w:t>Install the required Python packages:</w:t>
       </w:r>
     </w:p>
     <w:p>
       <w:pPr>
-        <w:pStyle w:val="ListNumber"/>
+        <w:pStyle w:val="NoSpacing"/>
       </w:pPr>
       <w:r>
-        <w:t>Install dependencies: py -3 -m pip install -r requirements.txt</w:t>
+        <w:rPr>
+          <w:rFonts w:ascii="Consolas" w:hAnsi="Consolas"/>
+        </w:rPr>
+        <w:t>pip install -r requirements.txt</w:t>
+      </w:r>
+    </w:p>
+    <w:p/>
+    <w:p>
+      <w:r>
+        <w:t>The following packages will be installed:</w:t>
+      </w:r>
+    </w:p>
+    <w:tbl>
+      <w:tblPr>
+        <w:tblStyle w:val="LightGrid-Accent1"/>
+        <w:tblW w:type="auto" w:w="0"/>
+        <w:jc w:val="left"/>
+        <w:tblLook w:firstColumn="1" w:firstRow="1" w:lastColumn="0" w:lastRow="0" w:noHBand="0" w:noVBand="1" w:val="04A0"/>
+      </w:tblPr>
+      <w:tblGrid>
+        <w:gridCol w:w="4320"/>
+        <w:gridCol w:w="4320"/>
+      </w:tblGrid>
+      <w:tr>
+        <w:tc>
+          <w:tcPr>
+            <w:tcW w:type="dxa" w:w="4320"/>
+          </w:tcPr>
+          <w:p>
+            <w:r>
+              <w:rPr>
+                <w:b/>
+                <w:sz w:val="20"/>
+              </w:rPr>
+              <w:t>Package</w:t>
+            </w:r>
+          </w:p>
+        </w:tc>
+        <w:tc>
+          <w:tcPr>
+            <w:tcW w:type="dxa" w:w="4320"/>
+          </w:tcPr>
+          <w:p>
+            <w:r>
+              <w:rPr>
+                <w:b/>
+                <w:sz w:val="20"/>
+              </w:rPr>
+              <w:t>Purpose</w:t>
+            </w:r>
+          </w:p>
+        </w:tc>
+      </w:tr>
+      <w:tr>
+        <w:tc>
+          <w:tcPr>
+            <w:tcW w:type="dxa" w:w="4320"/>
+          </w:tcPr>
+          <w:p>
+            <w:r>
+              <w:rPr>
+                <w:sz w:val="20"/>
+              </w:rPr>
+              <w:t>fastapi</w:t>
+            </w:r>
+          </w:p>
+        </w:tc>
+        <w:tc>
+          <w:tcPr>
+            <w:tcW w:type="dxa" w:w="4320"/>
+          </w:tcPr>
+          <w:p>
+            <w:r>
+              <w:rPr>
+                <w:sz w:val="20"/>
+              </w:rPr>
+              <w:t>Web framework for the API server</w:t>
+            </w:r>
+          </w:p>
+        </w:tc>
+      </w:tr>
+      <w:tr>
+        <w:tc>
+          <w:tcPr>
+            <w:tcW w:type="dxa" w:w="4320"/>
+          </w:tcPr>
+          <w:p>
+            <w:r>
+              <w:rPr>
+                <w:sz w:val="20"/>
+              </w:rPr>
+              <w:t>uvicorn</w:t>
+            </w:r>
+          </w:p>
+        </w:tc>
+        <w:tc>
+          <w:tcPr>
+            <w:tcW w:type="dxa" w:w="4320"/>
+          </w:tcPr>
+          <w:p>
+            <w:r>
+              <w:rPr>
+                <w:sz w:val="20"/>
+              </w:rPr>
+              <w:t>ASGI server to run FastAPI</w:t>
+            </w:r>
+          </w:p>
+        </w:tc>
+      </w:tr>
+      <w:tr>
+        <w:tc>
+          <w:tcPr>
+            <w:tcW w:type="dxa" w:w="4320"/>
+          </w:tcPr>
+          <w:p>
+            <w:r>
+              <w:rPr>
+                <w:sz w:val="20"/>
+              </w:rPr>
+              <w:t>yfinance</w:t>
+            </w:r>
+          </w:p>
+        </w:tc>
+        <w:tc>
+          <w:tcPr>
+            <w:tcW w:type="dxa" w:w="4320"/>
+          </w:tcPr>
+          <w:p>
+            <w:r>
+              <w:rPr>
+                <w:sz w:val="20"/>
+              </w:rPr>
+              <w:t>Download OHLCV data from Yahoo Finance</w:t>
+            </w:r>
+          </w:p>
+        </w:tc>
+      </w:tr>
+      <w:tr>
+        <w:tc>
+          <w:tcPr>
+            <w:tcW w:type="dxa" w:w="4320"/>
+          </w:tcPr>
+          <w:p>
+            <w:r>
+              <w:rPr>
+                <w:sz w:val="20"/>
+              </w:rPr>
+              <w:t>pandas</w:t>
+            </w:r>
+          </w:p>
+        </w:tc>
+        <w:tc>
+          <w:tcPr>
+            <w:tcW w:type="dxa" w:w="4320"/>
+          </w:tcPr>
+          <w:p>
+            <w:r>
+              <w:rPr>
+                <w:sz w:val="20"/>
+              </w:rPr>
+              <w:t>Data manipulation and analysis</w:t>
+            </w:r>
+          </w:p>
+        </w:tc>
+      </w:tr>
+      <w:tr>
+        <w:tc>
+          <w:tcPr>
+            <w:tcW w:type="dxa" w:w="4320"/>
+          </w:tcPr>
+          <w:p>
+            <w:r>
+              <w:rPr>
+                <w:sz w:val="20"/>
+              </w:rPr>
+              <w:t>numpy</w:t>
+            </w:r>
+          </w:p>
+        </w:tc>
+        <w:tc>
+          <w:tcPr>
+            <w:tcW w:type="dxa" w:w="4320"/>
+          </w:tcPr>
+          <w:p>
+            <w:r>
+              <w:rPr>
+                <w:sz w:val="20"/>
+              </w:rPr>
+              <w:t>Numerical computations for indicators</w:t>
+            </w:r>
+          </w:p>
+        </w:tc>
+      </w:tr>
+      <w:tr>
+        <w:tc>
+          <w:tcPr>
+            <w:tcW w:type="dxa" w:w="4320"/>
+          </w:tcPr>
+          <w:p>
+            <w:r>
+              <w:rPr>
+                <w:sz w:val="20"/>
+              </w:rPr>
+              <w:t>pydantic</w:t>
+            </w:r>
+          </w:p>
+        </w:tc>
+        <w:tc>
+          <w:tcPr>
+            <w:tcW w:type="dxa" w:w="4320"/>
+          </w:tcPr>
+          <w:p>
+            <w:r>
+              <w:rPr>
+                <w:sz w:val="20"/>
+              </w:rPr>
+              <w:t>Data validation and schemas</w:t>
+            </w:r>
+          </w:p>
+        </w:tc>
+      </w:tr>
+      <w:tr>
+        <w:tc>
+          <w:tcPr>
+            <w:tcW w:type="dxa" w:w="4320"/>
+          </w:tcPr>
+          <w:p>
+            <w:r>
+              <w:rPr>
+                <w:sz w:val="20"/>
+              </w:rPr>
+              <w:t>python-dotenv</w:t>
+            </w:r>
+          </w:p>
+        </w:tc>
+        <w:tc>
+          <w:tcPr>
+            <w:tcW w:type="dxa" w:w="4320"/>
+          </w:tcPr>
+          <w:p>
+            <w:r>
+              <w:rPr>
+                <w:sz w:val="20"/>
+              </w:rPr>
+              <w:t>Environment variable management</w:t>
+            </w:r>
+          </w:p>
+        </w:tc>
+      </w:tr>
+      <w:tr>
+        <w:tc>
+          <w:tcPr>
+            <w:tcW w:type="dxa" w:w="4320"/>
+          </w:tcPr>
+          <w:p>
+            <w:r>
+              <w:rPr>
+                <w:sz w:val="20"/>
+              </w:rPr>
+              <w:t>python-multipart</w:t>
+            </w:r>
+          </w:p>
+        </w:tc>
+        <w:tc>
+          <w:tcPr>
+            <w:tcW w:type="dxa" w:w="4320"/>
+          </w:tcPr>
+          <w:p>
+            <w:r>
+              <w:rPr>
+                <w:sz w:val="20"/>
+              </w:rPr>
+              <w:t>File upload support (CSV)</w:t>
+            </w:r>
+          </w:p>
+        </w:tc>
+      </w:tr>
+    </w:tbl>
+    <w:p/>
+    <w:p>
+      <w:pPr>
+        <w:pStyle w:val="Heading2"/>
+      </w:pPr>
+      <w:r>
+        <w:t>Step 2: Environment Configuration (Optional)</w:t>
+      </w:r>
+    </w:p>
+    <w:p>
+      <w:r>
+        <w:t>Copy the example environment file and adjust as needed:</w:t>
       </w:r>
     </w:p>
     <w:p>
       <w:pPr>
-        <w:pStyle w:val="ListNumber"/>
+        <w:pStyle w:val="NoSpacing"/>
       </w:pPr>
       <w:r>
-        <w:t>Start the server: py -3 run.py</w:t>
-      </w:r>
-    </w:p>
-    <w:p>
-      <w:pPr>
-        <w:pStyle w:val="ListNumber"/>
-      </w:pPr>
-      <w:r>
-        <w:t>Open your browser at http://localhost:8002</w:t>
-      </w:r>
-    </w:p>
-    <w:p>
-      <w:r>
-        <w:t>The default theme is Light mode. You can switch to Dark mode using the toggle in the top-right corner of the header. Your preference is saved in the browser.</w:t>
+        <w:rPr>
+          <w:rFonts w:ascii="Consolas" w:hAnsi="Consolas"/>
+        </w:rPr>
+        <w:t>cp .env.example .env</w:t>
       </w:r>
     </w:p>
     <w:p>
@@ -300,7 +512,83 @@
         <w:pStyle w:val="Heading1"/>
       </w:pPr>
       <w:r>
-        <w:t>3. User Interface</w:t>
+        <w:t>4. Running the Application</w:t>
+      </w:r>
+    </w:p>
+    <w:p>
+      <w:pPr>
+        <w:pStyle w:val="Heading2"/>
+      </w:pPr>
+      <w:r>
+        <w:t>Option A: Command Line</w:t>
+      </w:r>
+    </w:p>
+    <w:p>
+      <w:r>
+        <w:t>From the backtester directory, run:</w:t>
+      </w:r>
+    </w:p>
+    <w:p>
+      <w:pPr>
+        <w:pStyle w:val="NoSpacing"/>
+      </w:pPr>
+      <w:r>
+        <w:rPr>
+          <w:rFonts w:ascii="Consolas" w:hAnsi="Consolas"/>
+        </w:rPr>
+        <w:t>py -3 run.py</w:t>
+      </w:r>
+    </w:p>
+    <w:p/>
+    <w:p>
+      <w:r>
+        <w:t>The server starts on http://localhost:8002. Open this URL in your browser to access the UI. The server runs with hot-reload enabled, so code changes to server files are picked up automatically.</w:t>
+      </w:r>
+    </w:p>
+    <w:p>
+      <w:pPr>
+        <w:pStyle w:val="Heading2"/>
+      </w:pPr>
+      <w:r>
+        <w:t>Option B: PyCharm</w:t>
+      </w:r>
+    </w:p>
+    <w:p>
+      <w:r>
+        <w:t>A shared PyCharm run configuration is included in the repository. Open the project in PyCharm, then:</w:t>
+      </w:r>
+    </w:p>
+    <w:p>
+      <w:r>
+        <w:t>1. Select "Backtester" from the run configuration dropdown in the toolbar.</w:t>
+      </w:r>
+    </w:p>
+    <w:p>
+      <w:r>
+        <w:t>2. Click the Run button (green triangle) or press Shift+F10.</w:t>
+      </w:r>
+    </w:p>
+    <w:p>
+      <w:r>
+        <w:t>3. The server will start and you can open http://localhost:8002 in your browser.</w:t>
+      </w:r>
+    </w:p>
+    <w:p>
+      <w:r>
+        <w:t>The run configuration is stored in .idea/runConfigurations/Backtester.xml and is committed to git so all team members can use it.</w:t>
+      </w:r>
+    </w:p>
+    <w:p>
+      <w:pPr>
+        <w:pStyle w:val="Heading1"/>
+      </w:pPr>
+      <w:r>
+        <w:t>5. User Interface Guide</w:t>
+      </w:r>
+    </w:p>
+    <w:p>
+      <w:r>
+        <w:t>The application is a single-page web app with four views: New Backtest, Progress, Report, and History.</w:t>
       </w:r>
     </w:p>
     <w:p>
@@ -313,7 +601,7 @@
     </w:p>
     <w:p>
       <w:r>
-        <w:t>The sticky header contains the Rey Capital logo with company name, navigation buttons (New Backtest / History), and a Light/Dark theme toggle.</w:t>
+        <w:t>The header displays the Rey Capital logo and brand name, navigation buttons (New Backtest / History), and a Light/Dark theme toggle on the right side.</w:t>
       </w:r>
     </w:p>
     <w:p>
@@ -325,530 +613,8 @@
       </w:r>
     </w:p>
     <w:p>
-      <w:pPr>
-        <w:pStyle w:val="ListBullet"/>
-      </w:pPr>
       <w:r>
-        <w:t>Strategy Code: PineScript code editor with syntax placeholder</w:t>
-      </w:r>
-    </w:p>
-    <w:p>
-      <w:pPr>
-        <w:pStyle w:val="ListBullet"/>
-      </w:pPr>
-      <w:r>
-        <w:t>Parse &amp; Preview: Extract strategy parameters before running</w:t>
-      </w:r>
-    </w:p>
-    <w:p>
-      <w:pPr>
-        <w:pStyle w:val="ListBullet"/>
-      </w:pPr>
-      <w:r>
-        <w:t>Settings: Symbol, timeframe, date range, capital, leverage, commission, slippage</w:t>
-      </w:r>
-    </w:p>
-    <w:p>
-      <w:pPr>
-        <w:pStyle w:val="ListBullet"/>
-      </w:pPr>
-      <w:r>
-        <w:t>Data Source: Toggle between Yahoo Finance, CSV Upload, and MT5 Export Script</w:t>
-      </w:r>
-    </w:p>
-    <w:p>
-      <w:pPr>
-        <w:pStyle w:val="Heading2"/>
-      </w:pPr>
-      <w:r>
-        <w:t>Progress View</w:t>
-      </w:r>
-    </w:p>
-    <w:p>
-      <w:r>
-        <w:t>Shows a real-time progress bar with status messages during backtest execution.</w:t>
-      </w:r>
-    </w:p>
-    <w:p>
-      <w:pPr>
-        <w:pStyle w:val="Heading2"/>
-      </w:pPr>
-      <w:r>
-        <w:t>Report View</w:t>
-      </w:r>
-    </w:p>
-    <w:p>
-      <w:pPr>
-        <w:pStyle w:val="ListBullet"/>
-      </w:pPr>
-      <w:r>
-        <w:t>Strategy settings header with all configuration parameters</w:t>
-      </w:r>
-    </w:p>
-    <w:p>
-      <w:pPr>
-        <w:pStyle w:val="ListBullet"/>
-      </w:pPr>
-      <w:r>
-        <w:t>Three-column MQL5-style metrics grid (Performance, Drawdown, Trades)</w:t>
-      </w:r>
-    </w:p>
-    <w:p>
-      <w:pPr>
-        <w:pStyle w:val="ListBullet"/>
-      </w:pPr>
-      <w:r>
-        <w:t>Interactive equity curve and drawdown charts (Chart.js)</w:t>
-      </w:r>
-    </w:p>
-    <w:p>
-      <w:pPr>
-        <w:pStyle w:val="ListBullet"/>
-      </w:pPr>
-      <w:r>
-        <w:t>Sortable Orders and Deals tables</w:t>
-      </w:r>
-    </w:p>
-    <w:p>
-      <w:pPr>
-        <w:pStyle w:val="ListBullet"/>
-      </w:pPr>
-      <w:r>
-        <w:t>Summary row with totals for commission, swap, profit, and final balance</w:t>
-      </w:r>
-    </w:p>
-    <w:p>
-      <w:pPr>
-        <w:pStyle w:val="ListBullet"/>
-      </w:pPr>
-      <w:r>
-        <w:t>Download buttons for HTML report and Trades CSV</w:t>
-      </w:r>
-    </w:p>
-    <w:p>
-      <w:pPr>
-        <w:pStyle w:val="Heading2"/>
-      </w:pPr>
-      <w:r>
-        <w:t>History View</w:t>
-      </w:r>
-    </w:p>
-    <w:p>
-      <w:r>
-        <w:t>Lists all past backtests with key stats: Net Profit, Profit Factor, Total Trades, Win Rate, Max Drawdown. Click to re-view any completed backtest.</w:t>
-      </w:r>
-    </w:p>
-    <w:p>
-      <w:pPr>
-        <w:pStyle w:val="Heading1"/>
-      </w:pPr>
-      <w:r>
-        <w:t>4. Running a Backtest</w:t>
-      </w:r>
-    </w:p>
-    <w:p>
-      <w:pPr>
-        <w:pStyle w:val="ListNumber"/>
-      </w:pPr>
-      <w:r>
-        <w:t>Paste your PineScript strategy code into the code editor</w:t>
-      </w:r>
-    </w:p>
-    <w:p>
-      <w:pPr>
-        <w:pStyle w:val="ListNumber"/>
-      </w:pPr>
-      <w:r>
-        <w:t>Click "Parse &amp; Preview" to extract and review strategy parameters</w:t>
-      </w:r>
-    </w:p>
-    <w:p>
-      <w:pPr>
-        <w:pStyle w:val="ListNumber"/>
-      </w:pPr>
-      <w:r>
-        <w:t>Adjust extracted parameters if needed (inputs are editable)</w:t>
-      </w:r>
-    </w:p>
-    <w:p>
-      <w:pPr>
-        <w:pStyle w:val="ListNumber"/>
-      </w:pPr>
-      <w:r>
-        <w:t>Configure backtest settings: symbol, timeframe, date range, capital, etc.</w:t>
-      </w:r>
-    </w:p>
-    <w:p>
-      <w:pPr>
-        <w:pStyle w:val="ListNumber"/>
-      </w:pPr>
-      <w:r>
-        <w:t>Select your data source (Yahoo Finance, CSV Upload, or MT5 Export)</w:t>
-      </w:r>
-    </w:p>
-    <w:p>
-      <w:pPr>
-        <w:pStyle w:val="ListNumber"/>
-      </w:pPr>
-      <w:r>
-        <w:t>Click "Run Backtest" to start</w:t>
-      </w:r>
-    </w:p>
-    <w:p>
-      <w:pPr>
-        <w:pStyle w:val="ListNumber"/>
-      </w:pPr>
-      <w:r>
-        <w:t>Monitor progress in the Progress view</w:t>
-      </w:r>
-    </w:p>
-    <w:p>
-      <w:pPr>
-        <w:pStyle w:val="ListNumber"/>
-      </w:pPr>
-      <w:r>
-        <w:t>View comprehensive results in the Report view</w:t>
-      </w:r>
-    </w:p>
-    <w:p>
-      <w:pPr>
-        <w:pStyle w:val="Heading1"/>
-      </w:pPr>
-      <w:r>
-        <w:t>5. Data Sources</w:t>
-      </w:r>
-    </w:p>
-    <w:p>
-      <w:pPr>
-        <w:pStyle w:val="Heading2"/>
-      </w:pPr>
-      <w:r>
-        <w:t>Yahoo Finance (Default)</w:t>
-      </w:r>
-    </w:p>
-    <w:p>
-      <w:pPr>
-        <w:pStyle w:val="ListBullet"/>
-      </w:pPr>
-      <w:r>
-        <w:t>Automatically downloads OHLCV data via the yfinance library</w:t>
-      </w:r>
-    </w:p>
-    <w:p>
-      <w:pPr>
-        <w:pStyle w:val="ListBullet"/>
-      </w:pPr>
-      <w:r>
-        <w:t>Supports symbol aliases: XAUUSD → GC=F, BTCUSD → BTC-USD, NIFTY50 → ^NSEI, etc.</w:t>
-      </w:r>
-    </w:p>
-    <w:p>
-      <w:pPr>
-        <w:pStyle w:val="ListBullet"/>
-      </w:pPr>
-      <w:r>
-        <w:t>Data cached locally as Parquet files for faster subsequent runs</w:t>
-      </w:r>
-    </w:p>
-    <w:p>
-      <w:pPr>
-        <w:pStyle w:val="ListBullet"/>
-      </w:pPr>
-      <w:r>
-        <w:t>Intraday data limits: 1m/5m/15m (~60 days), 1h (~730 days)</w:t>
-      </w:r>
-    </w:p>
-    <w:p>
-      <w:pPr>
-        <w:pStyle w:val="ListBullet"/>
-      </w:pPr>
-      <w:r>
-        <w:t>Daily and weekly timeframes: 10+ years of reliable data</w:t>
-      </w:r>
-    </w:p>
-    <w:p>
-      <w:pPr>
-        <w:pStyle w:val="Heading2"/>
-      </w:pPr>
-      <w:r>
-        <w:t>CSV File Upload</w:t>
-      </w:r>
-    </w:p>
-    <w:p>
-      <w:pPr>
-        <w:pStyle w:val="ListBullet"/>
-      </w:pPr>
-      <w:r>
-        <w:t>Upload any CSV file with OHLCV data</w:t>
-      </w:r>
-    </w:p>
-    <w:p>
-      <w:pPr>
-        <w:pStyle w:val="ListBullet"/>
-      </w:pPr>
-      <w:r>
-        <w:t>Required columns: Date, Open, High, Low, Close (Volume is optional)</w:t>
-      </w:r>
-    </w:p>
-    <w:p>
-      <w:pPr>
-        <w:pStyle w:val="ListBullet"/>
-      </w:pPr>
-      <w:r>
-        <w:t>Flexible column name mapping (Date/Datetime/Timestamp, Open/O, High/H, etc.)</w:t>
-      </w:r>
-    </w:p>
-    <w:p>
-      <w:pPr>
-        <w:pStyle w:val="ListBullet"/>
-      </w:pPr>
-      <w:r>
-        <w:t>Supports drag-and-drop file upload</w:t>
-      </w:r>
-    </w:p>
-    <w:p>
-      <w:pPr>
-        <w:pStyle w:val="ListBullet"/>
-      </w:pPr>
-      <w:r>
-        <w:t>Ideal for broker-exported data or custom datasets</w:t>
-      </w:r>
-    </w:p>
-    <w:p>
-      <w:pPr>
-        <w:pStyle w:val="Heading2"/>
-      </w:pPr>
-      <w:r>
-        <w:t>MT5 Export Script</w:t>
-      </w:r>
-    </w:p>
-    <w:p>
-      <w:pPr>
-        <w:pStyle w:val="ListBullet"/>
-      </w:pPr>
-      <w:r>
-        <w:t>Generates a pre-configured MQL5 script based on your backtest settings</w:t>
-      </w:r>
-    </w:p>
-    <w:p>
-      <w:pPr>
-        <w:pStyle w:val="ListBullet"/>
-      </w:pPr>
-      <w:r>
-        <w:t>Click "Generate MT5 DataExporter Script" to create the script</w:t>
-      </w:r>
-    </w:p>
-    <w:p>
-      <w:pPr>
-        <w:pStyle w:val="ListBullet"/>
-      </w:pPr>
-      <w:r>
-        <w:t>Click "Download .mq5 File" to save it</w:t>
-      </w:r>
-    </w:p>
-    <w:p>
-      <w:pPr>
-        <w:pStyle w:val="ListBullet"/>
-      </w:pPr>
-      <w:r>
-        <w:t>Copy the file to your MT5 MQL5/Scripts/ folder and compile it</w:t>
-      </w:r>
-    </w:p>
-    <w:p>
-      <w:pPr>
-        <w:pStyle w:val="ListBullet"/>
-      </w:pPr>
-      <w:r>
-        <w:t>Drag the compiled script onto any chart in MetaTrader 5</w:t>
-      </w:r>
-    </w:p>
-    <w:p>
-      <w:pPr>
-        <w:pStyle w:val="ListBullet"/>
-      </w:pPr>
-      <w:r>
-        <w:t>The exported CSV will appear in the MQL5/Files/ directory</w:t>
-      </w:r>
-    </w:p>
-    <w:p>
-      <w:pPr>
-        <w:pStyle w:val="ListBullet"/>
-      </w:pPr>
-      <w:r>
-        <w:t>Upload the CSV using the "Upload CSV File" data source option</w:t>
-      </w:r>
-    </w:p>
-    <w:p>
-      <w:pPr>
-        <w:pStyle w:val="Heading1"/>
-      </w:pPr>
-      <w:r>
-        <w:t>6. Supported PineScript Features</w:t>
-      </w:r>
-    </w:p>
-    <w:p>
-      <w:pPr>
-        <w:pStyle w:val="Heading2"/>
-      </w:pPr>
-      <w:r>
-        <w:t>Supported</w:t>
-      </w:r>
-    </w:p>
-    <w:p>
-      <w:pPr>
-        <w:pStyle w:val="ListBullet"/>
-      </w:pPr>
-      <w:r>
-        <w:t>strategy() declaration with all settings (initial_capital, overlay, etc.)</w:t>
-      </w:r>
-    </w:p>
-    <w:p>
-      <w:pPr>
-        <w:pStyle w:val="ListBullet"/>
-      </w:pPr>
-      <w:r>
-        <w:t>input.int(), input.float(), input.bool(), input.string(), input.source()</w:t>
-      </w:r>
-    </w:p>
-    <w:p>
-      <w:pPr>
-        <w:pStyle w:val="ListBullet"/>
-      </w:pPr>
-      <w:r>
-        <w:t>ta.ema(), ta.sma(), ta.rsi(), ta.macd(), ta.atr(), ta.vwap()</w:t>
-      </w:r>
-    </w:p>
-    <w:p>
-      <w:pPr>
-        <w:pStyle w:val="ListBullet"/>
-      </w:pPr>
-      <w:r>
-        <w:t>ta.crossover(), ta.crossunder(), ta.highest(), ta.lowest()</w:t>
-      </w:r>
-    </w:p>
-    <w:p>
-      <w:pPr>
-        <w:pStyle w:val="ListBullet"/>
-      </w:pPr>
-      <w:r>
-        <w:t>Bollinger Bands (ta.bb), Stochastic (ta.stoch), Pivot Points</w:t>
-      </w:r>
-    </w:p>
-    <w:p>
-      <w:pPr>
-        <w:pStyle w:val="ListBullet"/>
-      </w:pPr>
-      <w:r>
-        <w:t>strategy.entry(), strategy.exit(), strategy.close(), strategy.close_all()</w:t>
-      </w:r>
-    </w:p>
-    <w:p>
-      <w:pPr>
-        <w:pStyle w:val="ListBullet"/>
-      </w:pPr>
-      <w:r>
-        <w:t>if/else conditional blocks</w:t>
-      </w:r>
-    </w:p>
-    <w:p>
-      <w:pPr>
-        <w:pStyle w:val="ListBullet"/>
-      </w:pPr>
-      <w:r>
-        <w:t>and/or/not boolean logic</w:t>
-      </w:r>
-    </w:p>
-    <w:p>
-      <w:pPr>
-        <w:pStyle w:val="ListBullet"/>
-      </w:pPr>
-      <w:r>
-        <w:t>Variable assignments and ternary expressions</w:t>
-      </w:r>
-    </w:p>
-    <w:p>
-      <w:pPr>
-        <w:pStyle w:val="ListBullet"/>
-      </w:pPr>
-      <w:r>
-        <w:t>switch blocks</w:t>
-      </w:r>
-    </w:p>
-    <w:p>
-      <w:pPr>
-        <w:pStyle w:val="ListBullet"/>
-      </w:pPr>
-      <w:r>
-        <w:t>request.security() (basic support)</w:t>
-      </w:r>
-    </w:p>
-    <w:p>
-      <w:pPr>
-        <w:pStyle w:val="Heading2"/>
-      </w:pPr>
-      <w:r>
-        <w:t>Not Supported (v1)</w:t>
-      </w:r>
-    </w:p>
-    <w:p>
-      <w:pPr>
-        <w:pStyle w:val="ListBullet"/>
-      </w:pPr>
-      <w:r>
-        <w:t>User-defined functions (f_myFunc())</w:t>
-      </w:r>
-    </w:p>
-    <w:p>
-      <w:pPr>
-        <w:pStyle w:val="ListBullet"/>
-      </w:pPr>
-      <w:r>
-        <w:t>for/while loops</w:t>
-      </w:r>
-    </w:p>
-    <w:p>
-      <w:pPr>
-        <w:pStyle w:val="ListBullet"/>
-      </w:pPr>
-      <w:r>
-        <w:t>Arrays and matrices</w:t>
-      </w:r>
-    </w:p>
-    <w:p>
-      <w:pPr>
-        <w:pStyle w:val="ListBullet"/>
-      </w:pPr>
-      <w:r>
-        <w:t>Pine Script libraries (import)</w:t>
-      </w:r>
-    </w:p>
-    <w:p>
-      <w:pPr>
-        <w:pStyle w:val="ListBullet"/>
-      </w:pPr>
-      <w:r>
-        <w:t>Complex switch expressions</w:t>
-      </w:r>
-    </w:p>
-    <w:p>
-      <w:pPr>
-        <w:pStyle w:val="ListBullet"/>
-      </w:pPr>
-      <w:r>
-        <w:t>alert() and plot functions (safely ignored during parsing)</w:t>
-      </w:r>
-    </w:p>
-    <w:p>
-      <w:pPr>
-        <w:pStyle w:val="Heading1"/>
-      </w:pPr>
-      <w:r>
-        <w:t>7. Report Metrics</w:t>
-      </w:r>
-    </w:p>
-    <w:p>
-      <w:r>
-        <w:t>The backtester computes 40+ metrics matching the MQL5 Strategy Tester report format:</w:t>
+        <w:t>This is the main input screen with three sections:</w:t>
       </w:r>
     </w:p>
     <w:p>
@@ -856,12 +622,12 @@
         <w:pStyle w:val="Heading3"/>
       </w:pPr>
       <w:r>
-        <w:t>Performance</w:t>
+        <w:t>Strategy Code</w:t>
       </w:r>
     </w:p>
     <w:p>
       <w:r>
-        <w:t>Total Net Profit, Gross Profit, Gross Loss, Profit Factor, Recovery Factor, Expected Payoff, Sharpe Ratio, AHPR, GHPR</w:t>
+        <w:t>Paste your PineScript v5 strategy code into the code editor. Click "Parse &amp; Preview" to extract and display the strategy parameters (inputs) before running the backtest.</w:t>
       </w:r>
     </w:p>
     <w:p>
@@ -869,178 +635,12 @@
         <w:pStyle w:val="Heading3"/>
       </w:pPr>
       <w:r>
-        <w:t>Drawdown</w:t>
+        <w:t>Settings</w:t>
       </w:r>
     </w:p>
     <w:p>
       <w:r>
-        <w:t>Balance Drawdown (Absolute, Maximal $+%, Relative), Equity Drawdown (Absolute, Maximal $+%, Relative)</w:t>
-      </w:r>
-    </w:p>
-    <w:p>
-      <w:pPr>
-        <w:pStyle w:val="Heading3"/>
-      </w:pPr>
-      <w:r>
-        <w:t>Trade Statistics</w:t>
-      </w:r>
-    </w:p>
-    <w:p>
-      <w:r>
-        <w:t>Total Trades, Long/Short trades with win%, Profit/Loss trades with %, Largest/Average profit and loss trades</w:t>
-      </w:r>
-    </w:p>
-    <w:p>
-      <w:pPr>
-        <w:pStyle w:val="Heading3"/>
-      </w:pPr>
-      <w:r>
-        <w:t>Consecutive</w:t>
-      </w:r>
-    </w:p>
-    <w:p>
-      <w:r>
-        <w:t>Max/Average consecutive wins and losses with dollar amounts</w:t>
-      </w:r>
-    </w:p>
-    <w:p>
-      <w:pPr>
-        <w:pStyle w:val="Heading3"/>
-      </w:pPr>
-      <w:r>
-        <w:t>Correlation &amp; Timing</w:t>
-      </w:r>
-    </w:p>
-    <w:p>
-      <w:r>
-        <w:t>Profits-MFE, Profits-MAE, MFE-MAE correlations, Min/Max/Avg holding time</w:t>
-      </w:r>
-    </w:p>
-    <w:p>
-      <w:pPr>
-        <w:pStyle w:val="Heading3"/>
-      </w:pPr>
-      <w:r>
-        <w:t>Other</w:t>
-      </w:r>
-    </w:p>
-    <w:p>
-      <w:r>
-        <w:t>LR Correlation, LR Standard Error, Z-Score, Total Bars, Total Deals</w:t>
-      </w:r>
-    </w:p>
-    <w:p>
-      <w:pPr>
-        <w:pStyle w:val="Heading1"/>
-      </w:pPr>
-      <w:r>
-        <w:t>8. Downloading Reports</w:t>
-      </w:r>
-    </w:p>
-    <w:p>
-      <w:pPr>
-        <w:pStyle w:val="ListBullet"/>
-      </w:pPr>
-      <w:r>
-        <w:t>HTML Report: Click "Download HTML Report" for a self-contained HTML file with Rey Capital branding, full metrics grid, orders/deals tables, and summary. Respects the current Light/Dark theme.</w:t>
-      </w:r>
-    </w:p>
-    <w:p>
-      <w:pPr>
-        <w:pStyle w:val="ListBullet"/>
-      </w:pPr>
-      <w:r>
-        <w:t>Trades CSV: Click "Download Trades CSV" for a CSV file containing all deal records with columns: Time, Deal, Symbol, Type, Direction, Volume, Price, Order, Commission, Swap, Profit, Balance, Comment.</w:t>
-      </w:r>
-    </w:p>
-    <w:p>
-      <w:pPr>
-        <w:pStyle w:val="Heading1"/>
-      </w:pPr>
-      <w:r>
-        <w:t>9. MT5 DataExporter Script (Standalone)</w:t>
-      </w:r>
-    </w:p>
-    <w:p>
-      <w:r>
-        <w:t>A standalone MQL5 script is also available at mql5/scripts/DataExporter.mq5 for use independently of the web application.</w:t>
-      </w:r>
-    </w:p>
-    <w:p>
-      <w:pPr>
-        <w:pStyle w:val="ListBullet"/>
-      </w:pPr>
-      <w:r>
-        <w:t>Location: mql5/scripts/DataExporter.mq5</w:t>
-      </w:r>
-    </w:p>
-    <w:p>
-      <w:pPr>
-        <w:pStyle w:val="ListBullet"/>
-      </w:pPr>
-      <w:r>
-        <w:t>Type: MQL5 Script (drag onto chart to run)</w:t>
-      </w:r>
-    </w:p>
-    <w:p>
-      <w:pPr>
-        <w:pStyle w:val="ListBullet"/>
-      </w:pPr>
-      <w:r>
-        <w:t>Configurable inputs: Symbol, Timeframe, Start Date, End Date, Output File Name</w:t>
-      </w:r>
-    </w:p>
-    <w:p>
-      <w:pPr>
-        <w:pStyle w:val="ListBullet"/>
-      </w:pPr>
-      <w:r>
-        <w:t>Default behavior: exports 5 years of data for the current chart symbol and timeframe</w:t>
-      </w:r>
-    </w:p>
-    <w:p>
-      <w:pPr>
-        <w:pStyle w:val="ListBullet"/>
-      </w:pPr>
-      <w:r>
-        <w:t>Output: CSV file in MQL5/Files/ with columns: Date, Time, Open, High, Low, Close, Volume</w:t>
-      </w:r>
-    </w:p>
-    <w:p>
-      <w:pPr>
-        <w:pStyle w:val="ListBullet"/>
-      </w:pPr>
-      <w:r>
-        <w:t>Uses the symbol's actual digit precision for OHLC values</w:t>
-      </w:r>
-    </w:p>
-    <w:p>
-      <w:pPr>
-        <w:pStyle w:val="ListBullet"/>
-      </w:pPr>
-      <w:r>
-        <w:t>Progress reporting (~10 updates) in the MT5 Experts tab</w:t>
-      </w:r>
-    </w:p>
-    <w:p>
-      <w:pPr>
-        <w:pStyle w:val="ListBullet"/>
-      </w:pPr>
-      <w:r>
-        <w:t>Comprehensive error handling with descriptive messages</w:t>
-      </w:r>
-    </w:p>
-    <w:p>
-      <w:pPr>
-        <w:pStyle w:val="Heading1"/>
-      </w:pPr>
-      <w:r>
-        <w:t>10. API Endpoints</w:t>
-      </w:r>
-    </w:p>
-    <w:p>
-      <w:r>
-        <w:t>The backtester exposes the following REST API endpoints:</w:t>
+        <w:t>Configure the backtest parameters:</w:t>
       </w:r>
     </w:p>
     <w:tbl>
@@ -1064,7 +664,1639 @@
             <w:r>
               <w:rPr>
                 <w:b/>
-                <w:sz w:val="18"/>
+                <w:sz w:val="20"/>
+              </w:rPr>
+              <w:t>Setting</w:t>
+            </w:r>
+          </w:p>
+        </w:tc>
+        <w:tc>
+          <w:tcPr>
+            <w:tcW w:type="dxa" w:w="2880"/>
+          </w:tcPr>
+          <w:p>
+            <w:r>
+              <w:rPr>
+                <w:b/>
+                <w:sz w:val="20"/>
+              </w:rPr>
+              <w:t>Description</w:t>
+            </w:r>
+          </w:p>
+        </w:tc>
+        <w:tc>
+          <w:tcPr>
+            <w:tcW w:type="dxa" w:w="2880"/>
+          </w:tcPr>
+          <w:p>
+            <w:r>
+              <w:rPr>
+                <w:b/>
+                <w:sz w:val="20"/>
+              </w:rPr>
+              <w:t>Default</w:t>
+            </w:r>
+          </w:p>
+        </w:tc>
+      </w:tr>
+      <w:tr>
+        <w:tc>
+          <w:tcPr>
+            <w:tcW w:type="dxa" w:w="2880"/>
+          </w:tcPr>
+          <w:p>
+            <w:r>
+              <w:rPr>
+                <w:sz w:val="20"/>
+              </w:rPr>
+              <w:t>Symbol</w:t>
+            </w:r>
+          </w:p>
+        </w:tc>
+        <w:tc>
+          <w:tcPr>
+            <w:tcW w:type="dxa" w:w="2880"/>
+          </w:tcPr>
+          <w:p>
+            <w:r>
+              <w:rPr>
+                <w:sz w:val="20"/>
+              </w:rPr>
+              <w:t>Trading instrument (e.g., XAUUSD, AAPL, BTC-USD)</w:t>
+            </w:r>
+          </w:p>
+        </w:tc>
+        <w:tc>
+          <w:tcPr>
+            <w:tcW w:type="dxa" w:w="2880"/>
+          </w:tcPr>
+          <w:p>
+            <w:r>
+              <w:rPr>
+                <w:sz w:val="20"/>
+              </w:rPr>
+              <w:t>XAUUSD</w:t>
+            </w:r>
+          </w:p>
+        </w:tc>
+      </w:tr>
+      <w:tr>
+        <w:tc>
+          <w:tcPr>
+            <w:tcW w:type="dxa" w:w="2880"/>
+          </w:tcPr>
+          <w:p>
+            <w:r>
+              <w:rPr>
+                <w:sz w:val="20"/>
+              </w:rPr>
+              <w:t>Timeframe</w:t>
+            </w:r>
+          </w:p>
+        </w:tc>
+        <w:tc>
+          <w:tcPr>
+            <w:tcW w:type="dxa" w:w="2880"/>
+          </w:tcPr>
+          <w:p>
+            <w:r>
+              <w:rPr>
+                <w:sz w:val="20"/>
+              </w:rPr>
+              <w:t>1m, 5m, 15m, 30m, 1h, 4h, Daily, Weekly</w:t>
+            </w:r>
+          </w:p>
+        </w:tc>
+        <w:tc>
+          <w:tcPr>
+            <w:tcW w:type="dxa" w:w="2880"/>
+          </w:tcPr>
+          <w:p>
+            <w:r>
+              <w:rPr>
+                <w:sz w:val="20"/>
+              </w:rPr>
+              <w:t>Daily</w:t>
+            </w:r>
+          </w:p>
+        </w:tc>
+      </w:tr>
+      <w:tr>
+        <w:tc>
+          <w:tcPr>
+            <w:tcW w:type="dxa" w:w="2880"/>
+          </w:tcPr>
+          <w:p>
+            <w:r>
+              <w:rPr>
+                <w:sz w:val="20"/>
+              </w:rPr>
+              <w:t>Start Date</w:t>
+            </w:r>
+          </w:p>
+        </w:tc>
+        <w:tc>
+          <w:tcPr>
+            <w:tcW w:type="dxa" w:w="2880"/>
+          </w:tcPr>
+          <w:p>
+            <w:r>
+              <w:rPr>
+                <w:sz w:val="20"/>
+              </w:rPr>
+              <w:t>Backtest start date</w:t>
+            </w:r>
+          </w:p>
+        </w:tc>
+        <w:tc>
+          <w:tcPr>
+            <w:tcW w:type="dxa" w:w="2880"/>
+          </w:tcPr>
+          <w:p>
+            <w:r>
+              <w:rPr>
+                <w:sz w:val="20"/>
+              </w:rPr>
+              <w:t>2020-01-01</w:t>
+            </w:r>
+          </w:p>
+        </w:tc>
+      </w:tr>
+      <w:tr>
+        <w:tc>
+          <w:tcPr>
+            <w:tcW w:type="dxa" w:w="2880"/>
+          </w:tcPr>
+          <w:p>
+            <w:r>
+              <w:rPr>
+                <w:sz w:val="20"/>
+              </w:rPr>
+              <w:t>End Date</w:t>
+            </w:r>
+          </w:p>
+        </w:tc>
+        <w:tc>
+          <w:tcPr>
+            <w:tcW w:type="dxa" w:w="2880"/>
+          </w:tcPr>
+          <w:p>
+            <w:r>
+              <w:rPr>
+                <w:sz w:val="20"/>
+              </w:rPr>
+              <w:t>Backtest end date</w:t>
+            </w:r>
+          </w:p>
+        </w:tc>
+        <w:tc>
+          <w:tcPr>
+            <w:tcW w:type="dxa" w:w="2880"/>
+          </w:tcPr>
+          <w:p>
+            <w:r>
+              <w:rPr>
+                <w:sz w:val="20"/>
+              </w:rPr>
+              <w:t>Today</w:t>
+            </w:r>
+          </w:p>
+        </w:tc>
+      </w:tr>
+      <w:tr>
+        <w:tc>
+          <w:tcPr>
+            <w:tcW w:type="dxa" w:w="2880"/>
+          </w:tcPr>
+          <w:p>
+            <w:r>
+              <w:rPr>
+                <w:sz w:val="20"/>
+              </w:rPr>
+              <w:t>Initial Capital</w:t>
+            </w:r>
+          </w:p>
+        </w:tc>
+        <w:tc>
+          <w:tcPr>
+            <w:tcW w:type="dxa" w:w="2880"/>
+          </w:tcPr>
+          <w:p>
+            <w:r>
+              <w:rPr>
+                <w:sz w:val="20"/>
+              </w:rPr>
+              <w:t>Starting account balance in USD</w:t>
+            </w:r>
+          </w:p>
+        </w:tc>
+        <w:tc>
+          <w:tcPr>
+            <w:tcW w:type="dxa" w:w="2880"/>
+          </w:tcPr>
+          <w:p>
+            <w:r>
+              <w:rPr>
+                <w:sz w:val="20"/>
+              </w:rPr>
+              <w:t>10,000</w:t>
+            </w:r>
+          </w:p>
+        </w:tc>
+      </w:tr>
+      <w:tr>
+        <w:tc>
+          <w:tcPr>
+            <w:tcW w:type="dxa" w:w="2880"/>
+          </w:tcPr>
+          <w:p>
+            <w:r>
+              <w:rPr>
+                <w:sz w:val="20"/>
+              </w:rPr>
+              <w:t>Leverage</w:t>
+            </w:r>
+          </w:p>
+        </w:tc>
+        <w:tc>
+          <w:tcPr>
+            <w:tcW w:type="dxa" w:w="2880"/>
+          </w:tcPr>
+          <w:p>
+            <w:r>
+              <w:rPr>
+                <w:sz w:val="20"/>
+              </w:rPr>
+              <w:t>Account leverage multiplier</w:t>
+            </w:r>
+          </w:p>
+        </w:tc>
+        <w:tc>
+          <w:tcPr>
+            <w:tcW w:type="dxa" w:w="2880"/>
+          </w:tcPr>
+          <w:p>
+            <w:r>
+              <w:rPr>
+                <w:sz w:val="20"/>
+              </w:rPr>
+              <w:t>1</w:t>
+            </w:r>
+          </w:p>
+        </w:tc>
+      </w:tr>
+      <w:tr>
+        <w:tc>
+          <w:tcPr>
+            <w:tcW w:type="dxa" w:w="2880"/>
+          </w:tcPr>
+          <w:p>
+            <w:r>
+              <w:rPr>
+                <w:sz w:val="20"/>
+              </w:rPr>
+              <w:t>Commission</w:t>
+            </w:r>
+          </w:p>
+        </w:tc>
+        <w:tc>
+          <w:tcPr>
+            <w:tcW w:type="dxa" w:w="2880"/>
+          </w:tcPr>
+          <w:p>
+            <w:r>
+              <w:rPr>
+                <w:sz w:val="20"/>
+              </w:rPr>
+              <w:t>Commission per trade as percentage</w:t>
+            </w:r>
+          </w:p>
+        </w:tc>
+        <w:tc>
+          <w:tcPr>
+            <w:tcW w:type="dxa" w:w="2880"/>
+          </w:tcPr>
+          <w:p>
+            <w:r>
+              <w:rPr>
+                <w:sz w:val="20"/>
+              </w:rPr>
+              <w:t>0%</w:t>
+            </w:r>
+          </w:p>
+        </w:tc>
+      </w:tr>
+      <w:tr>
+        <w:tc>
+          <w:tcPr>
+            <w:tcW w:type="dxa" w:w="2880"/>
+          </w:tcPr>
+          <w:p>
+            <w:r>
+              <w:rPr>
+                <w:sz w:val="20"/>
+              </w:rPr>
+              <w:t>Slippage</w:t>
+            </w:r>
+          </w:p>
+        </w:tc>
+        <w:tc>
+          <w:tcPr>
+            <w:tcW w:type="dxa" w:w="2880"/>
+          </w:tcPr>
+          <w:p>
+            <w:r>
+              <w:rPr>
+                <w:sz w:val="20"/>
+              </w:rPr>
+              <w:t>Slippage in price points per execution</w:t>
+            </w:r>
+          </w:p>
+        </w:tc>
+        <w:tc>
+          <w:tcPr>
+            <w:tcW w:type="dxa" w:w="2880"/>
+          </w:tcPr>
+          <w:p>
+            <w:r>
+              <w:rPr>
+                <w:sz w:val="20"/>
+              </w:rPr>
+              <w:t>0</w:t>
+            </w:r>
+          </w:p>
+        </w:tc>
+      </w:tr>
+    </w:tbl>
+    <w:p/>
+    <w:p>
+      <w:pPr>
+        <w:pStyle w:val="Heading3"/>
+      </w:pPr>
+      <w:r>
+        <w:t>Data Source</w:t>
+      </w:r>
+    </w:p>
+    <w:p>
+      <w:r>
+        <w:t>Choose one of three data sources:</w:t>
+      </w:r>
+    </w:p>
+    <w:p>
+      <w:r>
+        <w:rPr>
+          <w:b/>
+        </w:rPr>
+        <w:t xml:space="preserve">Yahoo Finance (Auto-download): </w:t>
+      </w:r>
+      <w:r>
+        <w:t>Automatically downloads OHLCV data. Best for daily and weekly timeframes. Intraday data has limited history: 1m/5m/15m covers ~60 days, 1h covers ~730 days.</w:t>
+      </w:r>
+    </w:p>
+    <w:p>
+      <w:r>
+        <w:rPr>
+          <w:b/>
+        </w:rPr>
+        <w:t xml:space="preserve">Upload CSV: </w:t>
+      </w:r>
+      <w:r>
+        <w:t>Drag &amp; drop or click to upload a CSV file with OHLCV data. Required columns: Date, Open, High, Low, Close, Volume. Column name matching is flexible.</w:t>
+      </w:r>
+    </w:p>
+    <w:p>
+      <w:r>
+        <w:rPr>
+          <w:b/>
+        </w:rPr>
+        <w:t xml:space="preserve">MT5 Export Script: </w:t>
+      </w:r>
+      <w:r>
+        <w:t>Generates a pre-configured MQL5 script based on your settings. Run the script in MetaTrader 5 to export data, then upload the resulting CSV file.</w:t>
+      </w:r>
+    </w:p>
+    <w:p>
+      <w:pPr>
+        <w:pStyle w:val="Heading1"/>
+      </w:pPr>
+      <w:r>
+        <w:t>6. Running a Backtest</w:t>
+      </w:r>
+    </w:p>
+    <w:p>
+      <w:r>
+        <w:t>1. Paste your PineScript v5 strategy code in the Strategy Code editor.</w:t>
+      </w:r>
+    </w:p>
+    <w:p>
+      <w:r>
+        <w:t>2. (Optional) Click "Parse &amp; Preview" to verify extracted parameters.</w:t>
+      </w:r>
+    </w:p>
+    <w:p>
+      <w:r>
+        <w:t>3. Set the symbol, timeframe, date range, capital, leverage, commission, and slippage.</w:t>
+      </w:r>
+    </w:p>
+    <w:p>
+      <w:r>
+        <w:t>4. Select your data source (Yahoo Finance, CSV upload, or MT5 Export).</w:t>
+      </w:r>
+    </w:p>
+    <w:p>
+      <w:r>
+        <w:t>5. Click "Run Backtest".</w:t>
+      </w:r>
+    </w:p>
+    <w:p>
+      <w:r>
+        <w:t>6. The Progress view shows a progress bar while the backtest runs.</w:t>
+      </w:r>
+    </w:p>
+    <w:p>
+      <w:r>
+        <w:t>7. When complete, the Report view is displayed automatically.</w:t>
+      </w:r>
+    </w:p>
+    <w:p>
+      <w:pPr>
+        <w:pStyle w:val="Heading1"/>
+      </w:pPr>
+      <w:r>
+        <w:t>7. Supported PineScript Features</w:t>
+      </w:r>
+    </w:p>
+    <w:p>
+      <w:r>
+        <w:t>The parser supports a practical subset of PineScript v5. The following features are supported:</w:t>
+      </w:r>
+    </w:p>
+    <w:p>
+      <w:pPr>
+        <w:pStyle w:val="Heading2"/>
+      </w:pPr>
+      <w:r>
+        <w:t>Strategy Declarations</w:t>
+      </w:r>
+    </w:p>
+    <w:p>
+      <w:r>
+        <w:t>strategy() with title, overlay, initial_capital, default_qty_type, default_qty_value, commission_type, commission_value, slippage, and other settings.</w:t>
+      </w:r>
+    </w:p>
+    <w:p>
+      <w:pPr>
+        <w:pStyle w:val="Heading2"/>
+      </w:pPr>
+      <w:r>
+        <w:t>Input Functions</w:t>
+      </w:r>
+    </w:p>
+    <w:p>
+      <w:pPr>
+        <w:pStyle w:val="ListBullet"/>
+      </w:pPr>
+      <w:r>
+        <w:t>input.int()</w:t>
+      </w:r>
+    </w:p>
+    <w:p>
+      <w:pPr>
+        <w:pStyle w:val="ListBullet"/>
+      </w:pPr>
+      <w:r>
+        <w:t>input.float()</w:t>
+      </w:r>
+    </w:p>
+    <w:p>
+      <w:pPr>
+        <w:pStyle w:val="ListBullet"/>
+      </w:pPr>
+      <w:r>
+        <w:t>input.bool()</w:t>
+      </w:r>
+    </w:p>
+    <w:p>
+      <w:pPr>
+        <w:pStyle w:val="ListBullet"/>
+      </w:pPr>
+      <w:r>
+        <w:t>input.string()</w:t>
+      </w:r>
+    </w:p>
+    <w:p>
+      <w:pPr>
+        <w:pStyle w:val="ListBullet"/>
+      </w:pPr>
+      <w:r>
+        <w:t>input.source()</w:t>
+      </w:r>
+    </w:p>
+    <w:p>
+      <w:pPr>
+        <w:pStyle w:val="ListBullet"/>
+      </w:pPr>
+      <w:r>
+        <w:t>input.timeframe()</w:t>
+      </w:r>
+    </w:p>
+    <w:p>
+      <w:pPr>
+        <w:pStyle w:val="ListBullet"/>
+      </w:pPr>
+      <w:r>
+        <w:t>input()</w:t>
+      </w:r>
+    </w:p>
+    <w:p>
+      <w:pPr>
+        <w:pStyle w:val="Heading2"/>
+      </w:pPr>
+      <w:r>
+        <w:t>Technical Indicators (ta.* namespace)</w:t>
+      </w:r>
+    </w:p>
+    <w:tbl>
+      <w:tblPr>
+        <w:tblStyle w:val="LightGrid-Accent1"/>
+        <w:tblW w:type="auto" w:w="0"/>
+        <w:jc w:val="left"/>
+        <w:tblLook w:firstColumn="1" w:firstRow="1" w:lastColumn="0" w:lastRow="0" w:noHBand="0" w:noVBand="1" w:val="04A0"/>
+      </w:tblPr>
+      <w:tblGrid>
+        <w:gridCol w:w="4320"/>
+        <w:gridCol w:w="4320"/>
+      </w:tblGrid>
+      <w:tr>
+        <w:tc>
+          <w:tcPr>
+            <w:tcW w:type="dxa" w:w="4320"/>
+          </w:tcPr>
+          <w:p>
+            <w:r>
+              <w:rPr>
+                <w:b/>
+                <w:sz w:val="20"/>
+              </w:rPr>
+              <w:t>Function</w:t>
+            </w:r>
+          </w:p>
+        </w:tc>
+        <w:tc>
+          <w:tcPr>
+            <w:tcW w:type="dxa" w:w="4320"/>
+          </w:tcPr>
+          <w:p>
+            <w:r>
+              <w:rPr>
+                <w:b/>
+                <w:sz w:val="20"/>
+              </w:rPr>
+              <w:t>Description</w:t>
+            </w:r>
+          </w:p>
+        </w:tc>
+      </w:tr>
+      <w:tr>
+        <w:tc>
+          <w:tcPr>
+            <w:tcW w:type="dxa" w:w="4320"/>
+          </w:tcPr>
+          <w:p>
+            <w:r>
+              <w:rPr>
+                <w:sz w:val="20"/>
+              </w:rPr>
+              <w:t>ta.ema(source, length)</w:t>
+            </w:r>
+          </w:p>
+        </w:tc>
+        <w:tc>
+          <w:tcPr>
+            <w:tcW w:type="dxa" w:w="4320"/>
+          </w:tcPr>
+          <w:p>
+            <w:r>
+              <w:rPr>
+                <w:sz w:val="20"/>
+              </w:rPr>
+              <w:t>Exponential Moving Average</w:t>
+            </w:r>
+          </w:p>
+        </w:tc>
+      </w:tr>
+      <w:tr>
+        <w:tc>
+          <w:tcPr>
+            <w:tcW w:type="dxa" w:w="4320"/>
+          </w:tcPr>
+          <w:p>
+            <w:r>
+              <w:rPr>
+                <w:sz w:val="20"/>
+              </w:rPr>
+              <w:t>ta.sma(source, length)</w:t>
+            </w:r>
+          </w:p>
+        </w:tc>
+        <w:tc>
+          <w:tcPr>
+            <w:tcW w:type="dxa" w:w="4320"/>
+          </w:tcPr>
+          <w:p>
+            <w:r>
+              <w:rPr>
+                <w:sz w:val="20"/>
+              </w:rPr>
+              <w:t>Simple Moving Average</w:t>
+            </w:r>
+          </w:p>
+        </w:tc>
+      </w:tr>
+      <w:tr>
+        <w:tc>
+          <w:tcPr>
+            <w:tcW w:type="dxa" w:w="4320"/>
+          </w:tcPr>
+          <w:p>
+            <w:r>
+              <w:rPr>
+                <w:sz w:val="20"/>
+              </w:rPr>
+              <w:t>ta.rsi(source, length)</w:t>
+            </w:r>
+          </w:p>
+        </w:tc>
+        <w:tc>
+          <w:tcPr>
+            <w:tcW w:type="dxa" w:w="4320"/>
+          </w:tcPr>
+          <w:p>
+            <w:r>
+              <w:rPr>
+                <w:sz w:val="20"/>
+              </w:rPr>
+              <w:t>Relative Strength Index</w:t>
+            </w:r>
+          </w:p>
+        </w:tc>
+      </w:tr>
+      <w:tr>
+        <w:tc>
+          <w:tcPr>
+            <w:tcW w:type="dxa" w:w="4320"/>
+          </w:tcPr>
+          <w:p>
+            <w:r>
+              <w:rPr>
+                <w:sz w:val="20"/>
+              </w:rPr>
+              <w:t>ta.macd(source, fast, slow, signal)</w:t>
+            </w:r>
+          </w:p>
+        </w:tc>
+        <w:tc>
+          <w:tcPr>
+            <w:tcW w:type="dxa" w:w="4320"/>
+          </w:tcPr>
+          <w:p>
+            <w:r>
+              <w:rPr>
+                <w:sz w:val="20"/>
+              </w:rPr>
+              <w:t>MACD (returns [macd, signal, hist])</w:t>
+            </w:r>
+          </w:p>
+        </w:tc>
+      </w:tr>
+      <w:tr>
+        <w:tc>
+          <w:tcPr>
+            <w:tcW w:type="dxa" w:w="4320"/>
+          </w:tcPr>
+          <w:p>
+            <w:r>
+              <w:rPr>
+                <w:sz w:val="20"/>
+              </w:rPr>
+              <w:t>ta.atr(length)</w:t>
+            </w:r>
+          </w:p>
+        </w:tc>
+        <w:tc>
+          <w:tcPr>
+            <w:tcW w:type="dxa" w:w="4320"/>
+          </w:tcPr>
+          <w:p>
+            <w:r>
+              <w:rPr>
+                <w:sz w:val="20"/>
+              </w:rPr>
+              <w:t>Average True Range</w:t>
+            </w:r>
+          </w:p>
+        </w:tc>
+      </w:tr>
+      <w:tr>
+        <w:tc>
+          <w:tcPr>
+            <w:tcW w:type="dxa" w:w="4320"/>
+          </w:tcPr>
+          <w:p>
+            <w:r>
+              <w:rPr>
+                <w:sz w:val="20"/>
+              </w:rPr>
+              <w:t>ta.vwap(source)</w:t>
+            </w:r>
+          </w:p>
+        </w:tc>
+        <w:tc>
+          <w:tcPr>
+            <w:tcW w:type="dxa" w:w="4320"/>
+          </w:tcPr>
+          <w:p>
+            <w:r>
+              <w:rPr>
+                <w:sz w:val="20"/>
+              </w:rPr>
+              <w:t>Volume Weighted Average Price</w:t>
+            </w:r>
+          </w:p>
+        </w:tc>
+      </w:tr>
+      <w:tr>
+        <w:tc>
+          <w:tcPr>
+            <w:tcW w:type="dxa" w:w="4320"/>
+          </w:tcPr>
+          <w:p>
+            <w:r>
+              <w:rPr>
+                <w:sz w:val="20"/>
+              </w:rPr>
+              <w:t>ta.bb(source, length, mult)</w:t>
+            </w:r>
+          </w:p>
+        </w:tc>
+        <w:tc>
+          <w:tcPr>
+            <w:tcW w:type="dxa" w:w="4320"/>
+          </w:tcPr>
+          <w:p>
+            <w:r>
+              <w:rPr>
+                <w:sz w:val="20"/>
+              </w:rPr>
+              <w:t>Bollinger Bands (returns [middle, upper, lower])</w:t>
+            </w:r>
+          </w:p>
+        </w:tc>
+      </w:tr>
+      <w:tr>
+        <w:tc>
+          <w:tcPr>
+            <w:tcW w:type="dxa" w:w="4320"/>
+          </w:tcPr>
+          <w:p>
+            <w:r>
+              <w:rPr>
+                <w:sz w:val="20"/>
+              </w:rPr>
+              <w:t>ta.stoch(close, high, low, length)</w:t>
+            </w:r>
+          </w:p>
+        </w:tc>
+        <w:tc>
+          <w:tcPr>
+            <w:tcW w:type="dxa" w:w="4320"/>
+          </w:tcPr>
+          <w:p>
+            <w:r>
+              <w:rPr>
+                <w:sz w:val="20"/>
+              </w:rPr>
+              <w:t>Stochastic (returns [K, D])</w:t>
+            </w:r>
+          </w:p>
+        </w:tc>
+      </w:tr>
+      <w:tr>
+        <w:tc>
+          <w:tcPr>
+            <w:tcW w:type="dxa" w:w="4320"/>
+          </w:tcPr>
+          <w:p>
+            <w:r>
+              <w:rPr>
+                <w:sz w:val="20"/>
+              </w:rPr>
+              <w:t>ta.pivothigh / ta.pivotlow</w:t>
+            </w:r>
+          </w:p>
+        </w:tc>
+        <w:tc>
+          <w:tcPr>
+            <w:tcW w:type="dxa" w:w="4320"/>
+          </w:tcPr>
+          <w:p>
+            <w:r>
+              <w:rPr>
+                <w:sz w:val="20"/>
+              </w:rPr>
+              <w:t>Pivot Points (PP, R1-R3, S1-S3)</w:t>
+            </w:r>
+          </w:p>
+        </w:tc>
+      </w:tr>
+      <w:tr>
+        <w:tc>
+          <w:tcPr>
+            <w:tcW w:type="dxa" w:w="4320"/>
+          </w:tcPr>
+          <w:p>
+            <w:r>
+              <w:rPr>
+                <w:sz w:val="20"/>
+              </w:rPr>
+              <w:t>ta.crossover(a, b)</w:t>
+            </w:r>
+          </w:p>
+        </w:tc>
+        <w:tc>
+          <w:tcPr>
+            <w:tcW w:type="dxa" w:w="4320"/>
+          </w:tcPr>
+          <w:p>
+            <w:r>
+              <w:rPr>
+                <w:sz w:val="20"/>
+              </w:rPr>
+              <w:t>True when a crosses above b</w:t>
+            </w:r>
+          </w:p>
+        </w:tc>
+      </w:tr>
+      <w:tr>
+        <w:tc>
+          <w:tcPr>
+            <w:tcW w:type="dxa" w:w="4320"/>
+          </w:tcPr>
+          <w:p>
+            <w:r>
+              <w:rPr>
+                <w:sz w:val="20"/>
+              </w:rPr>
+              <w:t>ta.crossunder(a, b)</w:t>
+            </w:r>
+          </w:p>
+        </w:tc>
+        <w:tc>
+          <w:tcPr>
+            <w:tcW w:type="dxa" w:w="4320"/>
+          </w:tcPr>
+          <w:p>
+            <w:r>
+              <w:rPr>
+                <w:sz w:val="20"/>
+              </w:rPr>
+              <w:t>True when a crosses below b</w:t>
+            </w:r>
+          </w:p>
+        </w:tc>
+      </w:tr>
+      <w:tr>
+        <w:tc>
+          <w:tcPr>
+            <w:tcW w:type="dxa" w:w="4320"/>
+          </w:tcPr>
+          <w:p>
+            <w:r>
+              <w:rPr>
+                <w:sz w:val="20"/>
+              </w:rPr>
+              <w:t>ta.highest(source, length)</w:t>
+            </w:r>
+          </w:p>
+        </w:tc>
+        <w:tc>
+          <w:tcPr>
+            <w:tcW w:type="dxa" w:w="4320"/>
+          </w:tcPr>
+          <w:p>
+            <w:r>
+              <w:rPr>
+                <w:sz w:val="20"/>
+              </w:rPr>
+              <w:t>Highest value over length bars</w:t>
+            </w:r>
+          </w:p>
+        </w:tc>
+      </w:tr>
+      <w:tr>
+        <w:tc>
+          <w:tcPr>
+            <w:tcW w:type="dxa" w:w="4320"/>
+          </w:tcPr>
+          <w:p>
+            <w:r>
+              <w:rPr>
+                <w:sz w:val="20"/>
+              </w:rPr>
+              <w:t>ta.lowest(source, length)</w:t>
+            </w:r>
+          </w:p>
+        </w:tc>
+        <w:tc>
+          <w:tcPr>
+            <w:tcW w:type="dxa" w:w="4320"/>
+          </w:tcPr>
+          <w:p>
+            <w:r>
+              <w:rPr>
+                <w:sz w:val="20"/>
+              </w:rPr>
+              <w:t>Lowest value over length bars</w:t>
+            </w:r>
+          </w:p>
+        </w:tc>
+      </w:tr>
+    </w:tbl>
+    <w:p/>
+    <w:p>
+      <w:pPr>
+        <w:pStyle w:val="Heading2"/>
+      </w:pPr>
+      <w:r>
+        <w:t>Strategy Functions</w:t>
+      </w:r>
+    </w:p>
+    <w:p>
+      <w:pPr>
+        <w:pStyle w:val="ListBullet"/>
+      </w:pPr>
+      <w:r>
+        <w:t>strategy.entry(id, direction, qty, limit, stop, comment)</w:t>
+      </w:r>
+    </w:p>
+    <w:p>
+      <w:pPr>
+        <w:pStyle w:val="ListBullet"/>
+      </w:pPr>
+      <w:r>
+        <w:t>strategy.exit(id, from_entry, profit, loss, limit, stop, trail_points, trail_offset)</w:t>
+      </w:r>
+    </w:p>
+    <w:p>
+      <w:pPr>
+        <w:pStyle w:val="ListBullet"/>
+      </w:pPr>
+      <w:r>
+        <w:t>strategy.close(id, comment)</w:t>
+      </w:r>
+    </w:p>
+    <w:p>
+      <w:pPr>
+        <w:pStyle w:val="ListBullet"/>
+      </w:pPr>
+      <w:r>
+        <w:t>strategy.close_all(comment)</w:t>
+      </w:r>
+    </w:p>
+    <w:p>
+      <w:pPr>
+        <w:pStyle w:val="Heading2"/>
+      </w:pPr>
+      <w:r>
+        <w:t>Control Flow &amp; Expressions</w:t>
+      </w:r>
+    </w:p>
+    <w:p>
+      <w:pPr>
+        <w:pStyle w:val="ListBullet"/>
+      </w:pPr>
+      <w:r>
+        <w:t>if / else if / else blocks</w:t>
+      </w:r>
+    </w:p>
+    <w:p>
+      <w:pPr>
+        <w:pStyle w:val="ListBullet"/>
+      </w:pPr>
+      <w:r>
+        <w:t>Ternary expressions (condition ? a : b)</w:t>
+      </w:r>
+    </w:p>
+    <w:p>
+      <w:pPr>
+        <w:pStyle w:val="ListBullet"/>
+      </w:pPr>
+      <w:r>
+        <w:t>switch blocks</w:t>
+      </w:r>
+    </w:p>
+    <w:p>
+      <w:pPr>
+        <w:pStyle w:val="ListBullet"/>
+      </w:pPr>
+      <w:r>
+        <w:t>Boolean operators: and, or, not</w:t>
+      </w:r>
+    </w:p>
+    <w:p>
+      <w:pPr>
+        <w:pStyle w:val="ListBullet"/>
+      </w:pPr>
+      <w:r>
+        <w:t>Comparison operators: &gt;, &lt;, &gt;=, &lt;=, ==, !=</w:t>
+      </w:r>
+    </w:p>
+    <w:p>
+      <w:pPr>
+        <w:pStyle w:val="ListBullet"/>
+      </w:pPr>
+      <w:r>
+        <w:t>Arithmetic: +, -, *, /</w:t>
+      </w:r>
+    </w:p>
+    <w:p>
+      <w:pPr>
+        <w:pStyle w:val="ListBullet"/>
+      </w:pPr>
+      <w:r>
+        <w:t>Variable assignments with var keyword</w:t>
+      </w:r>
+    </w:p>
+    <w:p>
+      <w:pPr>
+        <w:pStyle w:val="ListBullet"/>
+      </w:pPr>
+      <w:r>
+        <w:t>Destructuring assignments (e.g., [macdLine, signalLine, hist] = ta.macd(...))</w:t>
+      </w:r>
+    </w:p>
+    <w:p>
+      <w:pPr>
+        <w:pStyle w:val="ListBullet"/>
+      </w:pPr>
+      <w:r>
+        <w:t>request.security() for multi-timeframe data</w:t>
+      </w:r>
+    </w:p>
+    <w:p>
+      <w:pPr>
+        <w:pStyle w:val="Heading2"/>
+      </w:pPr>
+      <w:r>
+        <w:t>Not Supported (v1)</w:t>
+      </w:r>
+    </w:p>
+    <w:p>
+      <w:pPr>
+        <w:pStyle w:val="ListBullet"/>
+      </w:pPr>
+      <w:r>
+        <w:t>User-defined functions (f(x) =&gt;)</w:t>
+      </w:r>
+    </w:p>
+    <w:p>
+      <w:pPr>
+        <w:pStyle w:val="ListBullet"/>
+      </w:pPr>
+      <w:r>
+        <w:t>for / while loops</w:t>
+      </w:r>
+    </w:p>
+    <w:p>
+      <w:pPr>
+        <w:pStyle w:val="ListBullet"/>
+      </w:pPr>
+      <w:r>
+        <w:t>Arrays and matrices</w:t>
+      </w:r>
+    </w:p>
+    <w:p>
+      <w:pPr>
+        <w:pStyle w:val="ListBullet"/>
+      </w:pPr>
+      <w:r>
+        <w:t>Pine libraries (import)</w:t>
+      </w:r>
+    </w:p>
+    <w:p>
+      <w:pPr>
+        <w:pStyle w:val="ListBullet"/>
+      </w:pPr>
+      <w:r>
+        <w:t>Complex switch expressions</w:t>
+      </w:r>
+    </w:p>
+    <w:p>
+      <w:pPr>
+        <w:pStyle w:val="ListBullet"/>
+      </w:pPr>
+      <w:r>
+        <w:t>plot() and other visual-only functions (ignored safely)</w:t>
+      </w:r>
+    </w:p>
+    <w:p>
+      <w:pPr>
+        <w:pStyle w:val="Heading1"/>
+      </w:pPr>
+      <w:r>
+        <w:t>8. Report &amp; Metrics</w:t>
+      </w:r>
+    </w:p>
+    <w:p>
+      <w:r>
+        <w:t>The report follows the MetaTrader 5 Strategy Tester format with the following sections:</w:t>
+      </w:r>
+    </w:p>
+    <w:p>
+      <w:pPr>
+        <w:pStyle w:val="Heading2"/>
+      </w:pPr>
+      <w:r>
+        <w:t>Settings Summary</w:t>
+      </w:r>
+    </w:p>
+    <w:p>
+      <w:r>
+        <w:t>Displays the strategy name, symbol, timeframe, date range, initial capital, leverage, and all extracted input parameters.</w:t>
+      </w:r>
+    </w:p>
+    <w:p>
+      <w:pPr>
+        <w:pStyle w:val="Heading2"/>
+      </w:pPr>
+      <w:r>
+        <w:t>Performance Metrics</w:t>
+      </w:r>
+    </w:p>
+    <w:p>
+      <w:r>
+        <w:t>Over 40 metrics organized in a three-column grid:</w:t>
+      </w:r>
+    </w:p>
+    <w:tbl>
+      <w:tblPr>
+        <w:tblStyle w:val="LightGrid-Accent1"/>
+        <w:tblW w:type="auto" w:w="0"/>
+        <w:jc w:val="left"/>
+        <w:tblLook w:firstColumn="1" w:firstRow="1" w:lastColumn="0" w:lastRow="0" w:noHBand="0" w:noVBand="1" w:val="04A0"/>
+      </w:tblPr>
+      <w:tblGrid>
+        <w:gridCol w:w="4320"/>
+        <w:gridCol w:w="4320"/>
+      </w:tblGrid>
+      <w:tr>
+        <w:tc>
+          <w:tcPr>
+            <w:tcW w:type="dxa" w:w="4320"/>
+          </w:tcPr>
+          <w:p>
+            <w:r>
+              <w:rPr>
+                <w:b/>
+                <w:sz w:val="20"/>
+              </w:rPr>
+              <w:t>Category</w:t>
+            </w:r>
+          </w:p>
+        </w:tc>
+        <w:tc>
+          <w:tcPr>
+            <w:tcW w:type="dxa" w:w="4320"/>
+          </w:tcPr>
+          <w:p>
+            <w:r>
+              <w:rPr>
+                <w:b/>
+                <w:sz w:val="20"/>
+              </w:rPr>
+              <w:t>Metrics</w:t>
+            </w:r>
+          </w:p>
+        </w:tc>
+      </w:tr>
+      <w:tr>
+        <w:tc>
+          <w:tcPr>
+            <w:tcW w:type="dxa" w:w="4320"/>
+          </w:tcPr>
+          <w:p>
+            <w:r>
+              <w:rPr>
+                <w:sz w:val="20"/>
+              </w:rPr>
+              <w:t>Profit</w:t>
+            </w:r>
+          </w:p>
+        </w:tc>
+        <w:tc>
+          <w:tcPr>
+            <w:tcW w:type="dxa" w:w="4320"/>
+          </w:tcPr>
+          <w:p>
+            <w:r>
+              <w:rPr>
+                <w:sz w:val="20"/>
+              </w:rPr>
+              <w:t>Total Net Profit, Gross Profit, Gross Loss, Profit Factor, Expected Payoff</w:t>
+            </w:r>
+          </w:p>
+        </w:tc>
+      </w:tr>
+      <w:tr>
+        <w:tc>
+          <w:tcPr>
+            <w:tcW w:type="dxa" w:w="4320"/>
+          </w:tcPr>
+          <w:p>
+            <w:r>
+              <w:rPr>
+                <w:sz w:val="20"/>
+              </w:rPr>
+              <w:t>Risk</w:t>
+            </w:r>
+          </w:p>
+        </w:tc>
+        <w:tc>
+          <w:tcPr>
+            <w:tcW w:type="dxa" w:w="4320"/>
+          </w:tcPr>
+          <w:p>
+            <w:r>
+              <w:rPr>
+                <w:sz w:val="20"/>
+              </w:rPr>
+              <w:t>Recovery Factor, Sharpe Ratio, Max Drawdown ($, %), Equity Drawdown</w:t>
+            </w:r>
+          </w:p>
+        </w:tc>
+      </w:tr>
+      <w:tr>
+        <w:tc>
+          <w:tcPr>
+            <w:tcW w:type="dxa" w:w="4320"/>
+          </w:tcPr>
+          <w:p>
+            <w:r>
+              <w:rPr>
+                <w:sz w:val="20"/>
+              </w:rPr>
+              <w:t>Trades</w:t>
+            </w:r>
+          </w:p>
+        </w:tc>
+        <w:tc>
+          <w:tcPr>
+            <w:tcW w:type="dxa" w:w="4320"/>
+          </w:tcPr>
+          <w:p>
+            <w:r>
+              <w:rPr>
+                <w:sz w:val="20"/>
+              </w:rPr>
+              <w:t>Total Trades, Long/Short Wins (%), Profit/Loss Trade Count &amp; Percentage</w:t>
+            </w:r>
+          </w:p>
+        </w:tc>
+      </w:tr>
+      <w:tr>
+        <w:tc>
+          <w:tcPr>
+            <w:tcW w:type="dxa" w:w="4320"/>
+          </w:tcPr>
+          <w:p>
+            <w:r>
+              <w:rPr>
+                <w:sz w:val="20"/>
+              </w:rPr>
+              <w:t>Performance</w:t>
+            </w:r>
+          </w:p>
+        </w:tc>
+        <w:tc>
+          <w:tcPr>
+            <w:tcW w:type="dxa" w:w="4320"/>
+          </w:tcPr>
+          <w:p>
+            <w:r>
+              <w:rPr>
+                <w:sz w:val="20"/>
+              </w:rPr>
+              <w:t>AHPR, GHPR, Largest/Average Profit &amp; Loss per Trade</w:t>
+            </w:r>
+          </w:p>
+        </w:tc>
+      </w:tr>
+      <w:tr>
+        <w:tc>
+          <w:tcPr>
+            <w:tcW w:type="dxa" w:w="4320"/>
+          </w:tcPr>
+          <w:p>
+            <w:r>
+              <w:rPr>
+                <w:sz w:val="20"/>
+              </w:rPr>
+              <w:t>Consecutive</w:t>
+            </w:r>
+          </w:p>
+        </w:tc>
+        <w:tc>
+          <w:tcPr>
+            <w:tcW w:type="dxa" w:w="4320"/>
+          </w:tcPr>
+          <w:p>
+            <w:r>
+              <w:rPr>
+                <w:sz w:val="20"/>
+              </w:rPr>
+              <w:t>Max Consecutive Wins/Losses, Max Consecutive Profit/Loss ($)</w:t>
+            </w:r>
+          </w:p>
+        </w:tc>
+      </w:tr>
+      <w:tr>
+        <w:tc>
+          <w:tcPr>
+            <w:tcW w:type="dxa" w:w="4320"/>
+          </w:tcPr>
+          <w:p>
+            <w:r>
+              <w:rPr>
+                <w:sz w:val="20"/>
+              </w:rPr>
+              <w:t>Correlation</w:t>
+            </w:r>
+          </w:p>
+        </w:tc>
+        <w:tc>
+          <w:tcPr>
+            <w:tcW w:type="dxa" w:w="4320"/>
+          </w:tcPr>
+          <w:p>
+            <w:r>
+              <w:rPr>
+                <w:sz w:val="20"/>
+              </w:rPr>
+              <w:t>MFE, MAE, Profit-MFE, Profit-MAE correlations</w:t>
+            </w:r>
+          </w:p>
+        </w:tc>
+      </w:tr>
+      <w:tr>
+        <w:tc>
+          <w:tcPr>
+            <w:tcW w:type="dxa" w:w="4320"/>
+          </w:tcPr>
+          <w:p>
+            <w:r>
+              <w:rPr>
+                <w:sz w:val="20"/>
+              </w:rPr>
+              <w:t>Timing</w:t>
+            </w:r>
+          </w:p>
+        </w:tc>
+        <w:tc>
+          <w:tcPr>
+            <w:tcW w:type="dxa" w:w="4320"/>
+          </w:tcPr>
+          <w:p>
+            <w:r>
+              <w:rPr>
+                <w:sz w:val="20"/>
+              </w:rPr>
+              <w:t>Min/Max/Average Holding Time (HH:MM:SS)</w:t>
+            </w:r>
+          </w:p>
+        </w:tc>
+      </w:tr>
+      <w:tr>
+        <w:tc>
+          <w:tcPr>
+            <w:tcW w:type="dxa" w:w="4320"/>
+          </w:tcPr>
+          <w:p>
+            <w:r>
+              <w:rPr>
+                <w:sz w:val="20"/>
+              </w:rPr>
+              <w:t>Statistical</w:t>
+            </w:r>
+          </w:p>
+        </w:tc>
+        <w:tc>
+          <w:tcPr>
+            <w:tcW w:type="dxa" w:w="4320"/>
+          </w:tcPr>
+          <w:p>
+            <w:r>
+              <w:rPr>
+                <w:sz w:val="20"/>
+              </w:rPr>
+              <w:t>LR Correlation, LR Standard Error, Z-Score</w:t>
+            </w:r>
+          </w:p>
+        </w:tc>
+      </w:tr>
+    </w:tbl>
+    <w:p/>
+    <w:p>
+      <w:pPr>
+        <w:pStyle w:val="Heading2"/>
+      </w:pPr>
+      <w:r>
+        <w:t>Charts</w:t>
+      </w:r>
+    </w:p>
+    <w:p>
+      <w:r>
+        <w:rPr>
+          <w:b/>
+        </w:rPr>
+        <w:t xml:space="preserve">Equity Curve: </w:t>
+      </w:r>
+      <w:r>
+        <w:t>Balance over time showing account growth. Interactive Chart.js chart with hover tooltips.</w:t>
+      </w:r>
+    </w:p>
+    <w:p>
+      <w:r>
+        <w:rPr>
+          <w:b/>
+        </w:rPr>
+        <w:t xml:space="preserve">Drawdown: </w:t>
+      </w:r>
+      <w:r>
+        <w:t>Drawdown percentage over time, highlighting periods of decline from peak equity.</w:t>
+      </w:r>
+    </w:p>
+    <w:p>
+      <w:pPr>
+        <w:pStyle w:val="Heading2"/>
+      </w:pPr>
+      <w:r>
+        <w:t>Orders Table</w:t>
+      </w:r>
+    </w:p>
+    <w:p>
+      <w:r>
+        <w:t>Lists all orders with columns: Open Time, Order #, Symbol, Type, Volume, Price, S/L, T/P, State, Comment.</w:t>
+      </w:r>
+    </w:p>
+    <w:p>
+      <w:pPr>
+        <w:pStyle w:val="Heading2"/>
+      </w:pPr>
+      <w:r>
+        <w:t>Deals Table</w:t>
+      </w:r>
+    </w:p>
+    <w:p>
+      <w:r>
+        <w:t>Lists all deals with columns: Time, Deal #, Symbol, Type, Direction, Volume, Price, Order, Commission, Swap, Profit, Balance, Comment.</w:t>
+      </w:r>
+    </w:p>
+    <w:p>
+      <w:pPr>
+        <w:pStyle w:val="Heading2"/>
+      </w:pPr>
+      <w:r>
+        <w:t>Summary Row</w:t>
+      </w:r>
+    </w:p>
+    <w:p>
+      <w:r>
+        <w:t>Shows totals for Commission, Swap, Profit, and final Balance.</w:t>
+      </w:r>
+    </w:p>
+    <w:p>
+      <w:pPr>
+        <w:pStyle w:val="Heading1"/>
+      </w:pPr>
+      <w:r>
+        <w:t>9. Downloading Reports</w:t>
+      </w:r>
+    </w:p>
+    <w:p>
+      <w:r>
+        <w:t>Two download options are available from the report view:</w:t>
+      </w:r>
+    </w:p>
+    <w:p>
+      <w:r>
+        <w:rPr>
+          <w:b/>
+        </w:rPr>
+        <w:t xml:space="preserve">Download HTML Report: </w:t>
+      </w:r>
+      <w:r>
+        <w:t>Generates a self-contained HTML file with all metrics, charts, and tables embedded. Can be opened in any browser without a server.</w:t>
+      </w:r>
+    </w:p>
+    <w:p>
+      <w:r>
+        <w:rPr>
+          <w:b/>
+        </w:rPr>
+        <w:t xml:space="preserve">Download Trades CSV: </w:t>
+      </w:r>
+      <w:r>
+        <w:t>Exports all deal records as a CSV file for further analysis in Excel, Python, or other tools.</w:t>
+      </w:r>
+    </w:p>
+    <w:p>
+      <w:pPr>
+        <w:pStyle w:val="Heading1"/>
+      </w:pPr>
+      <w:r>
+        <w:t>10. MT5 DataExporter Integration</w:t>
+      </w:r>
+    </w:p>
+    <w:p>
+      <w:r>
+        <w:t>For instruments or timeframes not available via Yahoo Finance, you can export data directly from MetaTrader 5 using the built-in script generator.</w:t>
+      </w:r>
+    </w:p>
+    <w:p>
+      <w:r>
+        <w:t>1. In the Data Source section, select "MT5 Export Script".</w:t>
+      </w:r>
+    </w:p>
+    <w:p>
+      <w:r>
+        <w:t>2. Configure your symbol, timeframe, and date range in the Settings section above.</w:t>
+      </w:r>
+    </w:p>
+    <w:p>
+      <w:r>
+        <w:t>3. Click "Generate MT5 DataExporter Script".</w:t>
+      </w:r>
+    </w:p>
+    <w:p>
+      <w:r>
+        <w:t>4. Copy the generated MQL5 code.</w:t>
+      </w:r>
+    </w:p>
+    <w:p>
+      <w:r>
+        <w:t>5. In MetaTrader 5: File &gt; Open Data Folder &gt; MQL5 &gt; Scripts. Create a new .mq5 file and paste the code.</w:t>
+      </w:r>
+    </w:p>
+    <w:p>
+      <w:r>
+        <w:t>6. Compile the script (F7) and run it on any chart.</w:t>
+      </w:r>
+    </w:p>
+    <w:p>
+      <w:r>
+        <w:t>7. The exported CSV will be saved in the MQL5/Files/ directory.</w:t>
+      </w:r>
+    </w:p>
+    <w:p>
+      <w:r>
+        <w:t>8. Back in the backtester, switch to "Upload CSV" and upload the exported file.</w:t>
+      </w:r>
+    </w:p>
+    <w:p>
+      <w:pPr>
+        <w:pStyle w:val="Heading1"/>
+      </w:pPr>
+      <w:r>
+        <w:t>11. API Reference</w:t>
+      </w:r>
+    </w:p>
+    <w:p>
+      <w:r>
+        <w:t>The backtester exposes a REST API for programmatic access:</w:t>
+      </w:r>
+    </w:p>
+    <w:tbl>
+      <w:tblPr>
+        <w:tblStyle w:val="LightGrid-Accent1"/>
+        <w:tblW w:type="auto" w:w="0"/>
+        <w:jc w:val="left"/>
+        <w:tblLook w:firstColumn="1" w:firstRow="1" w:lastColumn="0" w:lastRow="0" w:noHBand="0" w:noVBand="1" w:val="04A0"/>
+      </w:tblPr>
+      <w:tblGrid>
+        <w:gridCol w:w="2880"/>
+        <w:gridCol w:w="2880"/>
+        <w:gridCol w:w="2880"/>
+      </w:tblGrid>
+      <w:tr>
+        <w:tc>
+          <w:tcPr>
+            <w:tcW w:type="dxa" w:w="2880"/>
+          </w:tcPr>
+          <w:p>
+            <w:r>
+              <w:rPr>
+                <w:b/>
+                <w:sz w:val="20"/>
               </w:rPr>
               <w:t>Method</w:t>
             </w:r>
@@ -1078,9 +2310,9 @@
             <w:r>
               <w:rPr>
                 <w:b/>
-                <w:sz w:val="18"/>
+                <w:sz w:val="20"/>
               </w:rPr>
-              <w:t>Path</w:t>
+              <w:t>Endpoint</w:t>
             </w:r>
           </w:p>
         </w:tc>
@@ -1092,7 +2324,7 @@
             <w:r>
               <w:rPr>
                 <w:b/>
-                <w:sz w:val="18"/>
+                <w:sz w:val="20"/>
               </w:rPr>
               <w:t>Description</w:t>
             </w:r>
@@ -1107,7 +2339,7 @@
           <w:p>
             <w:r>
               <w:rPr>
-                <w:sz w:val="18"/>
+                <w:sz w:val="20"/>
               </w:rPr>
               <w:t>GET</w:t>
             </w:r>
@@ -1120,7 +2352,7 @@
           <w:p>
             <w:r>
               <w:rPr>
-                <w:sz w:val="18"/>
+                <w:sz w:val="20"/>
               </w:rPr>
               <w:t>/</w:t>
             </w:r>
@@ -1133,9 +2365,9 @@
           <w:p>
             <w:r>
               <w:rPr>
-                <w:sz w:val="18"/>
+                <w:sz w:val="20"/>
               </w:rPr>
-              <w:t>Serve frontend</w:t>
+              <w:t>Serve the frontend UI</w:t>
             </w:r>
           </w:p>
         </w:tc>
@@ -1148,7 +2380,7 @@
           <w:p>
             <w:r>
               <w:rPr>
-                <w:sz w:val="18"/>
+                <w:sz w:val="20"/>
               </w:rPr>
               <w:t>POST</w:t>
             </w:r>
@@ -1161,7 +2393,48 @@
           <w:p>
             <w:r>
               <w:rPr>
-                <w:sz w:val="18"/>
+                <w:sz w:val="20"/>
+              </w:rPr>
+              <w:t>/api/parse</w:t>
+            </w:r>
+          </w:p>
+        </w:tc>
+        <w:tc>
+          <w:tcPr>
+            <w:tcW w:type="dxa" w:w="2880"/>
+          </w:tcPr>
+          <w:p>
+            <w:r>
+              <w:rPr>
+                <w:sz w:val="20"/>
+              </w:rPr>
+              <w:t>Parse PineScript code and return extracted parameters</w:t>
+            </w:r>
+          </w:p>
+        </w:tc>
+      </w:tr>
+      <w:tr>
+        <w:tc>
+          <w:tcPr>
+            <w:tcW w:type="dxa" w:w="2880"/>
+          </w:tcPr>
+          <w:p>
+            <w:r>
+              <w:rPr>
+                <w:sz w:val="20"/>
+              </w:rPr>
+              <w:t>POST</w:t>
+            </w:r>
+          </w:p>
+        </w:tc>
+        <w:tc>
+          <w:tcPr>
+            <w:tcW w:type="dxa" w:w="2880"/>
+          </w:tcPr>
+          <w:p>
+            <w:r>
+              <w:rPr>
+                <w:sz w:val="20"/>
               </w:rPr>
               <w:t>/api/backtest</w:t>
             </w:r>
@@ -1174,9 +2447,9 @@
           <w:p>
             <w:r>
               <w:rPr>
-                <w:sz w:val="18"/>
+                <w:sz w:val="20"/>
               </w:rPr>
-              <w:t>Submit backtest (Yahoo Finance data)</w:t>
+              <w:t>Submit a backtest with Yahoo Finance data</w:t>
             </w:r>
           </w:p>
         </w:tc>
@@ -1189,7 +2462,7 @@
           <w:p>
             <w:r>
               <w:rPr>
-                <w:sz w:val="18"/>
+                <w:sz w:val="20"/>
               </w:rPr>
               <w:t>POST</w:t>
             </w:r>
@@ -1202,7 +2475,7 @@
           <w:p>
             <w:r>
               <w:rPr>
-                <w:sz w:val="18"/>
+                <w:sz w:val="20"/>
               </w:rPr>
               <w:t>/api/backtest/csv</w:t>
             </w:r>
@@ -1215,9 +2488,9 @@
           <w:p>
             <w:r>
               <w:rPr>
-                <w:sz w:val="18"/>
+                <w:sz w:val="20"/>
               </w:rPr>
-              <w:t>Submit backtest with CSV file upload</w:t>
+              <w:t>Submit a backtest with uploaded CSV data</w:t>
             </w:r>
           </w:p>
         </w:tc>
@@ -1230,7 +2503,7 @@
           <w:p>
             <w:r>
               <w:rPr>
-                <w:sz w:val="18"/>
+                <w:sz w:val="20"/>
               </w:rPr>
               <w:t>GET</w:t>
             </w:r>
@@ -1243,7 +2516,7 @@
           <w:p>
             <w:r>
               <w:rPr>
-                <w:sz w:val="18"/>
+                <w:sz w:val="20"/>
               </w:rPr>
               <w:t>/api/backtest/{id}/status</w:t>
             </w:r>
@@ -1256,9 +2529,9 @@
           <w:p>
             <w:r>
               <w:rPr>
-                <w:sz w:val="18"/>
+                <w:sz w:val="20"/>
               </w:rPr>
-              <w:t>Poll backtest progress</w:t>
+              <w:t>Poll backtest progress (returns percentage and status)</w:t>
             </w:r>
           </w:p>
         </w:tc>
@@ -1271,7 +2544,7 @@
           <w:p>
             <w:r>
               <w:rPr>
-                <w:sz w:val="18"/>
+                <w:sz w:val="20"/>
               </w:rPr>
               <w:t>GET</w:t>
             </w:r>
@@ -1284,7 +2557,7 @@
           <w:p>
             <w:r>
               <w:rPr>
-                <w:sz w:val="18"/>
+                <w:sz w:val="20"/>
               </w:rPr>
               <w:t>/api/backtest/{id}/report</w:t>
             </w:r>
@@ -1297,9 +2570,9 @@
           <w:p>
             <w:r>
               <w:rPr>
-                <w:sz w:val="18"/>
+                <w:sz w:val="20"/>
               </w:rPr>
-              <w:t>Get full MQL5-style report JSON</w:t>
+              <w:t>Get the full MQL5-style report as JSON</w:t>
             </w:r>
           </w:p>
         </w:tc>
@@ -1312,7 +2585,7 @@
           <w:p>
             <w:r>
               <w:rPr>
-                <w:sz w:val="18"/>
+                <w:sz w:val="20"/>
               </w:rPr>
               <w:t>GET</w:t>
             </w:r>
@@ -1325,7 +2598,7 @@
           <w:p>
             <w:r>
               <w:rPr>
-                <w:sz w:val="18"/>
+                <w:sz w:val="20"/>
               </w:rPr>
               <w:t>/api/backtests</w:t>
             </w:r>
@@ -1338,9 +2611,9 @@
           <w:p>
             <w:r>
               <w:rPr>
-                <w:sz w:val="18"/>
+                <w:sz w:val="20"/>
               </w:rPr>
-              <w:t>List all backtests</w:t>
+              <w:t>List all previous backtests</w:t>
             </w:r>
           </w:p>
         </w:tc>
@@ -1353,7 +2626,7 @@
           <w:p>
             <w:r>
               <w:rPr>
-                <w:sz w:val="18"/>
+                <w:sz w:val="20"/>
               </w:rPr>
               <w:t>DELETE</w:t>
             </w:r>
@@ -1366,7 +2639,7 @@
           <w:p>
             <w:r>
               <w:rPr>
-                <w:sz w:val="18"/>
+                <w:sz w:val="20"/>
               </w:rPr>
               <w:t>/api/backtest/{id}</w:t>
             </w:r>
@@ -1379,9 +2652,9 @@
           <w:p>
             <w:r>
               <w:rPr>
-                <w:sz w:val="18"/>
+                <w:sz w:val="20"/>
               </w:rPr>
-              <w:t>Delete a backtest</w:t>
+              <w:t>Delete a backtest and its results</w:t>
             </w:r>
           </w:p>
         </w:tc>
@@ -1394,9 +2667,9 @@
           <w:p>
             <w:r>
               <w:rPr>
-                <w:sz w:val="18"/>
+                <w:sz w:val="20"/>
               </w:rPr>
-              <w:t>POST</w:t>
+              <w:t>GET</w:t>
             </w:r>
           </w:p>
         </w:tc>
@@ -1407,9 +2680,9 @@
           <w:p>
             <w:r>
               <w:rPr>
-                <w:sz w:val="18"/>
+                <w:sz w:val="20"/>
               </w:rPr>
-              <w:t>/api/parse</w:t>
+              <w:t>/api/symbols/search?q=</w:t>
             </w:r>
           </w:p>
         </w:tc>
@@ -1420,9 +2693,9 @@
           <w:p>
             <w:r>
               <w:rPr>
-                <w:sz w:val="18"/>
+                <w:sz w:val="20"/>
               </w:rPr>
-              <w:t>Parse PineScript code, return parameters</w:t>
+              <w:t>Search for symbols (autocomplete)</w:t>
             </w:r>
           </w:p>
         </w:tc>
@@ -1435,7 +2708,7 @@
           <w:p>
             <w:r>
               <w:rPr>
-                <w:sz w:val="18"/>
+                <w:sz w:val="20"/>
               </w:rPr>
               <w:t>GET</w:t>
             </w:r>
@@ -1448,48 +2721,7 @@
           <w:p>
             <w:r>
               <w:rPr>
-                <w:sz w:val="18"/>
-              </w:rPr>
-              <w:t>/api/symbols/search?q=</w:t>
-            </w:r>
-          </w:p>
-        </w:tc>
-        <w:tc>
-          <w:tcPr>
-            <w:tcW w:type="dxa" w:w="2880"/>
-          </w:tcPr>
-          <w:p>
-            <w:r>
-              <w:rPr>
-                <w:sz w:val="18"/>
-              </w:rPr>
-              <w:t>Symbol autocomplete search</w:t>
-            </w:r>
-          </w:p>
-        </w:tc>
-      </w:tr>
-      <w:tr>
-        <w:tc>
-          <w:tcPr>
-            <w:tcW w:type="dxa" w:w="2880"/>
-          </w:tcPr>
-          <w:p>
-            <w:r>
-              <w:rPr>
-                <w:sz w:val="18"/>
-              </w:rPr>
-              <w:t>GET</w:t>
-            </w:r>
-          </w:p>
-        </w:tc>
-        <w:tc>
-          <w:tcPr>
-            <w:tcW w:type="dxa" w:w="2880"/>
-          </w:tcPr>
-          <w:p>
-            <w:r>
-              <w:rPr>
-                <w:sz w:val="18"/>
+                <w:sz w:val="20"/>
               </w:rPr>
               <w:t>/api/health</w:t>
             </w:r>
@@ -1502,83 +2734,581 @@
           <w:p>
             <w:r>
               <w:rPr>
-                <w:sz w:val="18"/>
+                <w:sz w:val="20"/>
               </w:rPr>
-              <w:t>Health check</w:t>
+              <w:t>Health check endpoint</w:t>
             </w:r>
           </w:p>
         </w:tc>
       </w:tr>
     </w:tbl>
+    <w:p/>
     <w:p>
       <w:pPr>
         <w:pStyle w:val="Heading1"/>
       </w:pPr>
       <w:r>
-        <w:t>11. Project Structure</w:t>
+        <w:t>12. Project Structure</w:t>
+      </w:r>
+    </w:p>
+    <w:tbl>
+      <w:tblPr>
+        <w:tblStyle w:val="LightGrid-Accent1"/>
+        <w:tblW w:type="auto" w:w="0"/>
+        <w:jc w:val="left"/>
+        <w:tblLook w:firstColumn="1" w:firstRow="1" w:lastColumn="0" w:lastRow="0" w:noHBand="0" w:noVBand="1" w:val="04A0"/>
+      </w:tblPr>
+      <w:tblGrid>
+        <w:gridCol w:w="4320"/>
+        <w:gridCol w:w="4320"/>
+      </w:tblGrid>
+      <w:tr>
+        <w:tc>
+          <w:tcPr>
+            <w:tcW w:type="dxa" w:w="4320"/>
+          </w:tcPr>
+          <w:p>
+            <w:r>
+              <w:rPr>
+                <w:b/>
+                <w:sz w:val="20"/>
+              </w:rPr>
+              <w:t>Path</w:t>
+            </w:r>
+          </w:p>
+        </w:tc>
+        <w:tc>
+          <w:tcPr>
+            <w:tcW w:type="dxa" w:w="4320"/>
+          </w:tcPr>
+          <w:p>
+            <w:r>
+              <w:rPr>
+                <w:b/>
+                <w:sz w:val="20"/>
+              </w:rPr>
+              <w:t>Description</w:t>
+            </w:r>
+          </w:p>
+        </w:tc>
+      </w:tr>
+      <w:tr>
+        <w:tc>
+          <w:tcPr>
+            <w:tcW w:type="dxa" w:w="4320"/>
+          </w:tcPr>
+          <w:p>
+            <w:r>
+              <w:rPr>
+                <w:sz w:val="20"/>
+              </w:rPr>
+              <w:t>tools/backtester/run.py</w:t>
+            </w:r>
+          </w:p>
+        </w:tc>
+        <w:tc>
+          <w:tcPr>
+            <w:tcW w:type="dxa" w:w="4320"/>
+          </w:tcPr>
+          <w:p>
+            <w:r>
+              <w:rPr>
+                <w:sz w:val="20"/>
+              </w:rPr>
+              <w:t>Uvicorn entry point (port 8002, hot-reload enabled)</w:t>
+            </w:r>
+          </w:p>
+        </w:tc>
+      </w:tr>
+      <w:tr>
+        <w:tc>
+          <w:tcPr>
+            <w:tcW w:type="dxa" w:w="4320"/>
+          </w:tcPr>
+          <w:p>
+            <w:r>
+              <w:rPr>
+                <w:sz w:val="20"/>
+              </w:rPr>
+              <w:t>tools/backtester/requirements.txt</w:t>
+            </w:r>
+          </w:p>
+        </w:tc>
+        <w:tc>
+          <w:tcPr>
+            <w:tcW w:type="dxa" w:w="4320"/>
+          </w:tcPr>
+          <w:p>
+            <w:r>
+              <w:rPr>
+                <w:sz w:val="20"/>
+              </w:rPr>
+              <w:t>Python package dependencies</w:t>
+            </w:r>
+          </w:p>
+        </w:tc>
+      </w:tr>
+      <w:tr>
+        <w:tc>
+          <w:tcPr>
+            <w:tcW w:type="dxa" w:w="4320"/>
+          </w:tcPr>
+          <w:p>
+            <w:r>
+              <w:rPr>
+                <w:sz w:val="20"/>
+              </w:rPr>
+              <w:t>tools/backtester/server/main.py</w:t>
+            </w:r>
+          </w:p>
+        </w:tc>
+        <w:tc>
+          <w:tcPr>
+            <w:tcW w:type="dxa" w:w="4320"/>
+          </w:tcPr>
+          <w:p>
+            <w:r>
+              <w:rPr>
+                <w:sz w:val="20"/>
+              </w:rPr>
+              <w:t>FastAPI application with all API routes</w:t>
+            </w:r>
+          </w:p>
+        </w:tc>
+      </w:tr>
+      <w:tr>
+        <w:tc>
+          <w:tcPr>
+            <w:tcW w:type="dxa" w:w="4320"/>
+          </w:tcPr>
+          <w:p>
+            <w:r>
+              <w:rPr>
+                <w:sz w:val="20"/>
+              </w:rPr>
+              <w:t>tools/backtester/server/models.py</w:t>
+            </w:r>
+          </w:p>
+        </w:tc>
+        <w:tc>
+          <w:tcPr>
+            <w:tcW w:type="dxa" w:w="4320"/>
+          </w:tcPr>
+          <w:p>
+            <w:r>
+              <w:rPr>
+                <w:sz w:val="20"/>
+              </w:rPr>
+              <w:t>Pydantic request/response schemas</w:t>
+            </w:r>
+          </w:p>
+        </w:tc>
+      </w:tr>
+      <w:tr>
+        <w:tc>
+          <w:tcPr>
+            <w:tcW w:type="dxa" w:w="4320"/>
+          </w:tcPr>
+          <w:p>
+            <w:r>
+              <w:rPr>
+                <w:sz w:val="20"/>
+              </w:rPr>
+              <w:t>tools/backtester/server/database.py</w:t>
+            </w:r>
+          </w:p>
+        </w:tc>
+        <w:tc>
+          <w:tcPr>
+            <w:tcW w:type="dxa" w:w="4320"/>
+          </w:tcPr>
+          <w:p>
+            <w:r>
+              <w:rPr>
+                <w:sz w:val="20"/>
+              </w:rPr>
+              <w:t>SQLite database tables and CRUD operations</w:t>
+            </w:r>
+          </w:p>
+        </w:tc>
+      </w:tr>
+      <w:tr>
+        <w:tc>
+          <w:tcPr>
+            <w:tcW w:type="dxa" w:w="4320"/>
+          </w:tcPr>
+          <w:p>
+            <w:r>
+              <w:rPr>
+                <w:sz w:val="20"/>
+              </w:rPr>
+              <w:t>tools/backtester/server/data.py</w:t>
+            </w:r>
+          </w:p>
+        </w:tc>
+        <w:tc>
+          <w:tcPr>
+            <w:tcW w:type="dxa" w:w="4320"/>
+          </w:tcPr>
+          <w:p>
+            <w:r>
+              <w:rPr>
+                <w:sz w:val="20"/>
+              </w:rPr>
+              <w:t>Yahoo Finance data download and caching</w:t>
+            </w:r>
+          </w:p>
+        </w:tc>
+      </w:tr>
+      <w:tr>
+        <w:tc>
+          <w:tcPr>
+            <w:tcW w:type="dxa" w:w="4320"/>
+          </w:tcPr>
+          <w:p>
+            <w:r>
+              <w:rPr>
+                <w:sz w:val="20"/>
+              </w:rPr>
+              <w:t>tools/backtester/server/parser/lexer.py</w:t>
+            </w:r>
+          </w:p>
+        </w:tc>
+        <w:tc>
+          <w:tcPr>
+            <w:tcW w:type="dxa" w:w="4320"/>
+          </w:tcPr>
+          <w:p>
+            <w:r>
+              <w:rPr>
+                <w:sz w:val="20"/>
+              </w:rPr>
+              <w:t>PineScript tokenizer</w:t>
+            </w:r>
+          </w:p>
+        </w:tc>
+      </w:tr>
+      <w:tr>
+        <w:tc>
+          <w:tcPr>
+            <w:tcW w:type="dxa" w:w="4320"/>
+          </w:tcPr>
+          <w:p>
+            <w:r>
+              <w:rPr>
+                <w:sz w:val="20"/>
+              </w:rPr>
+              <w:t>tools/backtester/server/parser/ast_nodes.py</w:t>
+            </w:r>
+          </w:p>
+        </w:tc>
+        <w:tc>
+          <w:tcPr>
+            <w:tcW w:type="dxa" w:w="4320"/>
+          </w:tcPr>
+          <w:p>
+            <w:r>
+              <w:rPr>
+                <w:sz w:val="20"/>
+              </w:rPr>
+              <w:t>AST node type definitions</w:t>
+            </w:r>
+          </w:p>
+        </w:tc>
+      </w:tr>
+      <w:tr>
+        <w:tc>
+          <w:tcPr>
+            <w:tcW w:type="dxa" w:w="4320"/>
+          </w:tcPr>
+          <w:p>
+            <w:r>
+              <w:rPr>
+                <w:sz w:val="20"/>
+              </w:rPr>
+              <w:t>tools/backtester/server/parser/parser.py</w:t>
+            </w:r>
+          </w:p>
+        </w:tc>
+        <w:tc>
+          <w:tcPr>
+            <w:tcW w:type="dxa" w:w="4320"/>
+          </w:tcPr>
+          <w:p>
+            <w:r>
+              <w:rPr>
+                <w:sz w:val="20"/>
+              </w:rPr>
+              <w:t>Recursive descent PineScript parser</w:t>
+            </w:r>
+          </w:p>
+        </w:tc>
+      </w:tr>
+      <w:tr>
+        <w:tc>
+          <w:tcPr>
+            <w:tcW w:type="dxa" w:w="4320"/>
+          </w:tcPr>
+          <w:p>
+            <w:r>
+              <w:rPr>
+                <w:sz w:val="20"/>
+              </w:rPr>
+              <w:t>tools/backtester/server/parser/transpiler.py</w:t>
+            </w:r>
+          </w:p>
+        </w:tc>
+        <w:tc>
+          <w:tcPr>
+            <w:tcW w:type="dxa" w:w="4320"/>
+          </w:tcPr>
+          <w:p>
+            <w:r>
+              <w:rPr>
+                <w:sz w:val="20"/>
+              </w:rPr>
+              <w:t>AST to strategy definition converter</w:t>
+            </w:r>
+          </w:p>
+        </w:tc>
+      </w:tr>
+      <w:tr>
+        <w:tc>
+          <w:tcPr>
+            <w:tcW w:type="dxa" w:w="4320"/>
+          </w:tcPr>
+          <w:p>
+            <w:r>
+              <w:rPr>
+                <w:sz w:val="20"/>
+              </w:rPr>
+              <w:t>tools/backtester/server/engine/indicators.py</w:t>
+            </w:r>
+          </w:p>
+        </w:tc>
+        <w:tc>
+          <w:tcPr>
+            <w:tcW w:type="dxa" w:w="4320"/>
+          </w:tcPr>
+          <w:p>
+            <w:r>
+              <w:rPr>
+                <w:sz w:val="20"/>
+              </w:rPr>
+              <w:t>Technical indicator implementations</w:t>
+            </w:r>
+          </w:p>
+        </w:tc>
+      </w:tr>
+      <w:tr>
+        <w:tc>
+          <w:tcPr>
+            <w:tcW w:type="dxa" w:w="4320"/>
+          </w:tcPr>
+          <w:p>
+            <w:r>
+              <w:rPr>
+                <w:sz w:val="20"/>
+              </w:rPr>
+              <w:t>tools/backtester/server/engine/backtest.py</w:t>
+            </w:r>
+          </w:p>
+        </w:tc>
+        <w:tc>
+          <w:tcPr>
+            <w:tcW w:type="dxa" w:w="4320"/>
+          </w:tcPr>
+          <w:p>
+            <w:r>
+              <w:rPr>
+                <w:sz w:val="20"/>
+              </w:rPr>
+              <w:t>Bar-by-bar simulation engine</w:t>
+            </w:r>
+          </w:p>
+        </w:tc>
+      </w:tr>
+      <w:tr>
+        <w:tc>
+          <w:tcPr>
+            <w:tcW w:type="dxa" w:w="4320"/>
+          </w:tcPr>
+          <w:p>
+            <w:r>
+              <w:rPr>
+                <w:sz w:val="20"/>
+              </w:rPr>
+              <w:t>tools/backtester/server/engine/position.py</w:t>
+            </w:r>
+          </w:p>
+        </w:tc>
+        <w:tc>
+          <w:tcPr>
+            <w:tcW w:type="dxa" w:w="4320"/>
+          </w:tcPr>
+          <w:p>
+            <w:r>
+              <w:rPr>
+                <w:sz w:val="20"/>
+              </w:rPr>
+              <w:t>Order, deal, and position management</w:t>
+            </w:r>
+          </w:p>
+        </w:tc>
+      </w:tr>
+      <w:tr>
+        <w:tc>
+          <w:tcPr>
+            <w:tcW w:type="dxa" w:w="4320"/>
+          </w:tcPr>
+          <w:p>
+            <w:r>
+              <w:rPr>
+                <w:sz w:val="20"/>
+              </w:rPr>
+              <w:t>tools/backtester/server/engine/metrics.py</w:t>
+            </w:r>
+          </w:p>
+        </w:tc>
+        <w:tc>
+          <w:tcPr>
+            <w:tcW w:type="dxa" w:w="4320"/>
+          </w:tcPr>
+          <w:p>
+            <w:r>
+              <w:rPr>
+                <w:sz w:val="20"/>
+              </w:rPr>
+              <w:t>MQL5 metrics computation (40+ metrics)</w:t>
+            </w:r>
+          </w:p>
+        </w:tc>
+      </w:tr>
+      <w:tr>
+        <w:tc>
+          <w:tcPr>
+            <w:tcW w:type="dxa" w:w="4320"/>
+          </w:tcPr>
+          <w:p>
+            <w:r>
+              <w:rPr>
+                <w:sz w:val="20"/>
+              </w:rPr>
+              <w:t>tools/backtester/client/index.html</w:t>
+            </w:r>
+          </w:p>
+        </w:tc>
+        <w:tc>
+          <w:tcPr>
+            <w:tcW w:type="dxa" w:w="4320"/>
+          </w:tcPr>
+          <w:p>
+            <w:r>
+              <w:rPr>
+                <w:sz w:val="20"/>
+              </w:rPr>
+              <w:t>Single-page application frontend</w:t>
+            </w:r>
+          </w:p>
+        </w:tc>
+      </w:tr>
+      <w:tr>
+        <w:tc>
+          <w:tcPr>
+            <w:tcW w:type="dxa" w:w="4320"/>
+          </w:tcPr>
+          <w:p>
+            <w:r>
+              <w:rPr>
+                <w:sz w:val="20"/>
+              </w:rPr>
+              <w:t>tools/backtester/client/styles.css</w:t>
+            </w:r>
+          </w:p>
+        </w:tc>
+        <w:tc>
+          <w:tcPr>
+            <w:tcW w:type="dxa" w:w="4320"/>
+          </w:tcPr>
+          <w:p>
+            <w:r>
+              <w:rPr>
+                <w:sz w:val="20"/>
+              </w:rPr>
+              <w:t>Light and dark theme stylesheets</w:t>
+            </w:r>
+          </w:p>
+        </w:tc>
+      </w:tr>
+      <w:tr>
+        <w:tc>
+          <w:tcPr>
+            <w:tcW w:type="dxa" w:w="4320"/>
+          </w:tcPr>
+          <w:p>
+            <w:r>
+              <w:rPr>
+                <w:sz w:val="20"/>
+              </w:rPr>
+              <w:t>tools/backtester/client/app.js</w:t>
+            </w:r>
+          </w:p>
+        </w:tc>
+        <w:tc>
+          <w:tcPr>
+            <w:tcW w:type="dxa" w:w="4320"/>
+          </w:tcPr>
+          <w:p>
+            <w:r>
+              <w:rPr>
+                <w:sz w:val="20"/>
+              </w:rPr>
+              <w:t>Frontend logic, API calls, and chart rendering</w:t>
+            </w:r>
+          </w:p>
+        </w:tc>
+      </w:tr>
+      <w:tr>
+        <w:tc>
+          <w:tcPr>
+            <w:tcW w:type="dxa" w:w="4320"/>
+          </w:tcPr>
+          <w:p>
+            <w:r>
+              <w:rPr>
+                <w:sz w:val="20"/>
+              </w:rPr>
+              <w:t>tools/backtester/data/</w:t>
+            </w:r>
+          </w:p>
+        </w:tc>
+        <w:tc>
+          <w:tcPr>
+            <w:tcW w:type="dxa" w:w="4320"/>
+          </w:tcPr>
+          <w:p>
+            <w:r>
+              <w:rPr>
+                <w:sz w:val="20"/>
+              </w:rPr>
+              <w:t>Runtime data directory (gitignored)</w:t>
+            </w:r>
+          </w:p>
+        </w:tc>
+      </w:tr>
+    </w:tbl>
+    <w:p/>
+    <w:p>
+      <w:pPr>
+        <w:pStyle w:val="Heading1"/>
+      </w:pPr>
+      <w:r>
+        <w:t>13. Theme Support</w:t>
       </w:r>
     </w:p>
     <w:p>
       <w:r>
-        <w:rPr>
-          <w:rFonts w:ascii="Consolas" w:hAnsi="Consolas"/>
-          <w:sz w:val="17"/>
-        </w:rPr>
-        <w:t>tools/backtester/</w:t>
-        <w:br/>
-        <w:t>+-- run.py                        Uvicorn entry point (port 8002)</w:t>
-        <w:br/>
-        <w:t>+-- requirements.txt              Python dependencies</w:t>
-        <w:br/>
-        <w:t>+-- server/</w:t>
-        <w:br/>
-        <w:t>|   +-- main.py                   FastAPI routes + CSV upload</w:t>
-        <w:br/>
-        <w:t>|   +-- models.py                 Pydantic schemas (40+ metrics)</w:t>
-        <w:br/>
-        <w:t>|   +-- database.py               SQLite persistence (6 tables)</w:t>
-        <w:br/>
-        <w:t>|   +-- data.py                   yfinance download + parquet cache</w:t>
-        <w:br/>
-        <w:t>|   +-- parser/</w:t>
-        <w:br/>
-        <w:t>|   |   +-- lexer.py              PineScript tokenizer</w:t>
-        <w:br/>
-        <w:t>|   |   +-- ast_nodes.py          AST node dataclasses</w:t>
-        <w:br/>
-        <w:t>|   |   +-- parser.py             Recursive descent parser</w:t>
-        <w:br/>
-        <w:t>|   |   +-- transpiler.py         AST to strategy definition</w:t>
-        <w:br/>
-        <w:t>|   +-- engine/</w:t>
-        <w:br/>
-        <w:t>|   |   +-- indicators.py         14 technical indicators</w:t>
-        <w:br/>
-        <w:t>|   |   +-- backtest.py           Bar-by-bar simulation loop</w:t>
-        <w:br/>
-        <w:t>|   |   +-- position.py           Order/Deal/Position management</w:t>
-        <w:br/>
-        <w:t>|   |   +-- metrics.py            MQL5 metrics computation</w:t>
-        <w:br/>
-        <w:t>|   +-- report/</w:t>
-        <w:br/>
-        <w:t>|       +-- generator.py          Report assembly pipeline</w:t>
-        <w:br/>
-        <w:t>|       +-- charts.py             Chart data preparation</w:t>
-        <w:br/>
-        <w:t>+-- client/</w:t>
-        <w:br/>
-        <w:t>|   +-- index.html                SPA frontend</w:t>
-        <w:br/>
-        <w:t>|   +-- styles.css                Light/Dark theme CSS</w:t>
-        <w:br/>
-        <w:t>|   +-- app.js                    Frontend logic + MT5 generator</w:t>
-        <w:br/>
-        <w:t>+-- data/                         Runtime data (gitignored)</w:t>
-        <w:br/>
-        <w:t xml:space="preserve">    +-- cache/                    OHLCV parquet cache</w:t>
-        <w:br/>
-        <w:t xml:space="preserve">    +-- backtester.db             SQLite database</w:t>
+        <w:t>The application supports Light and Dark themes. The default theme is Light. Toggle the theme using the Light/Dark buttons in the top-right corner of the header. Your preference is saved in the browser and persists across sessions.</w:t>
       </w:r>
     </w:p>
     <w:p>
@@ -1586,51 +3316,20 @@
         <w:pStyle w:val="Heading1"/>
       </w:pPr>
       <w:r>
-        <w:t>12. Troubleshooting</w:t>
+        <w:t>14. Backtest History</w:t>
       </w:r>
     </w:p>
     <w:p>
       <w:r>
-        <w:rPr>
-          <w:b/>
-        </w:rPr>
-        <w:t xml:space="preserve">"No data available" error: </w:t>
-      </w:r>
-      <w:r>
-        <w:t>Check the symbol name. Use Yahoo Finance format (e.g., AAPL, MSFT) or supported aliases (XAUUSD, BTCUSD, NIFTY50). Verify the date range has available data.</w:t>
+        <w:t>All backtests are saved to a local SQLite database. Click "History" in the navigation bar to view past backtests. Click any entry to re-view its full report. Backtests can be deleted individually from the history view or via the API.</w:t>
       </w:r>
     </w:p>
     <w:p>
+      <w:pPr>
+        <w:pStyle w:val="Heading1"/>
+      </w:pPr>
       <w:r>
-        <w:rPr>
-          <w:b/>
-        </w:rPr>
-        <w:t xml:space="preserve">yfinance rate limiting: </w:t>
-      </w:r>
-      <w:r>
-        <w:t>Wait a few minutes and try again. Alternatively, use the CSV Upload or MT5 Export data source instead.</w:t>
-      </w:r>
-    </w:p>
-    <w:p>
-      <w:r>
-        <w:rPr>
-          <w:b/>
-        </w:rPr>
-        <w:t xml:space="preserve">Intraday data limited: </w:t>
-      </w:r>
-      <w:r>
-        <w:t>yfinance only provides ~60 days of minute-level data. For backtests longer than 60 days, use Daily (1D) or Weekly (1W) timeframes.</w:t>
-      </w:r>
-    </w:p>
-    <w:p>
-      <w:r>
-        <w:rPr>
-          <w:b/>
-        </w:rPr>
-        <w:t xml:space="preserve">Parser errors: </w:t>
-      </w:r>
-      <w:r>
-        <w:t>Ensure your PineScript code is v5 syntax. Check unsupported features in Section 6. The parser will skip unknown functions gracefully.</w:t>
+        <w:t>15. Troubleshooting</w:t>
       </w:r>
     </w:p>
     <w:p>
@@ -1641,7 +3340,51 @@
         <w:t xml:space="preserve">Server won't start: </w:t>
       </w:r>
       <w:r>
-        <w:t>Ensure all dependencies are installed (py -3 -m pip install -r requirements.txt). Check that port 8002 is not already in use.</w:t>
+        <w:t>Ensure Python 3.10+ is installed and all dependencies are installed via pip install -r requirements.txt. Check that port 8002 is not in use.</w:t>
+      </w:r>
+    </w:p>
+    <w:p>
+      <w:r>
+        <w:rPr>
+          <w:b/>
+        </w:rPr>
+        <w:t xml:space="preserve">No data returned for symbol: </w:t>
+      </w:r>
+      <w:r>
+        <w:t>Verify the symbol is valid on Yahoo Finance. For forex pairs, use the Yahoo format (e.g., XAUUSD=X). For crypto, use BTC-USD format.</w:t>
+      </w:r>
+    </w:p>
+    <w:p>
+      <w:r>
+        <w:rPr>
+          <w:b/>
+        </w:rPr>
+        <w:t xml:space="preserve">Intraday data is limited: </w:t>
+      </w:r>
+      <w:r>
+        <w:t>Yahoo Finance only provides ~60 days of 1m/5m/15m data and ~730 days of 1h data. Use daily or weekly timeframes for longer backtests, or export data from MT5.</w:t>
+      </w:r>
+    </w:p>
+    <w:p>
+      <w:r>
+        <w:rPr>
+          <w:b/>
+        </w:rPr>
+        <w:t xml:space="preserve">Parse errors on PineScript code: </w:t>
+      </w:r>
+      <w:r>
+        <w:t>The parser supports a subset of PineScript v5. User-defined functions, loops, arrays, and libraries are not supported. Simplify your strategy to use supported features.</w:t>
+      </w:r>
+    </w:p>
+    <w:p>
+      <w:r>
+        <w:rPr>
+          <w:b/>
+        </w:rPr>
+        <w:t xml:space="preserve">CSV upload fails: </w:t>
+      </w:r>
+      <w:r>
+        <w:t>Ensure your CSV has Date, Open, High, Low, Close, and Volume columns. Column names are matched flexibly but must be recognizable.</w:t>
       </w:r>
     </w:p>
     <w:p>
@@ -1652,7 +3395,18 @@
         <w:t xml:space="preserve">Charts not rendering: </w:t>
       </w:r>
       <w:r>
-        <w:t>Ensure internet access for the Chart.js CDN. Check browser console for JavaScript errors.</w:t>
+        <w:t>Check that Chart.js CDN is accessible. If behind a firewall, you may need to host Chart.js locally.</w:t>
+      </w:r>
+    </w:p>
+    <w:p>
+      <w:r>
+        <w:rPr>
+          <w:b/>
+        </w:rPr>
+        <w:t xml:space="preserve">Database errors: </w:t>
+      </w:r>
+      <w:r>
+        <w:t>Delete the tools/backtester/data/backtester.db file to reset the database. All history will be lost.</w:t>
       </w:r>
     </w:p>
     <w:sectPr>
@@ -2033,7 +3787,7 @@
     </w:pPr>
     <w:rPr>
       <w:rFonts w:ascii="Calibri" w:hAnsi="Calibri"/>
-      <w:sz w:val="21"/>
+      <w:sz w:val="22"/>
     </w:rPr>
   </w:style>
   <w:style w:type="paragraph" w:styleId="Header">
@@ -2095,7 +3849,7 @@
       <w:outlineLvl w:val="0"/>
     </w:pPr>
     <w:rPr>
-      <w:rFonts w:asciiTheme="majorHAnsi" w:eastAsiaTheme="majorEastAsia" w:hAnsiTheme="majorHAnsi" w:cstheme="majorBidi" w:ascii="Calibri Light" w:hAnsi="Calibri Light"/>
+      <w:rFonts w:asciiTheme="majorHAnsi" w:eastAsiaTheme="majorEastAsia" w:hAnsiTheme="majorHAnsi" w:cstheme="majorBidi"/>
       <w:b/>
       <w:bCs/>
       <w:color w:val="1B4FBE"/>
@@ -2119,7 +3873,7 @@
       <w:outlineLvl w:val="1"/>
     </w:pPr>
     <w:rPr>
-      <w:rFonts w:asciiTheme="majorHAnsi" w:eastAsiaTheme="majorEastAsia" w:hAnsiTheme="majorHAnsi" w:cstheme="majorBidi" w:ascii="Calibri Light" w:hAnsi="Calibri Light"/>
+      <w:rFonts w:asciiTheme="majorHAnsi" w:eastAsiaTheme="majorEastAsia" w:hAnsiTheme="majorHAnsi" w:cstheme="majorBidi"/>
       <w:b/>
       <w:bCs/>
       <w:color w:val="1B4FBE"/>
@@ -2143,7 +3897,7 @@
       <w:outlineLvl w:val="2"/>
     </w:pPr>
     <w:rPr>
-      <w:rFonts w:asciiTheme="majorHAnsi" w:eastAsiaTheme="majorEastAsia" w:hAnsiTheme="majorHAnsi" w:cstheme="majorBidi" w:ascii="Calibri Light" w:hAnsi="Calibri Light"/>
+      <w:rFonts w:asciiTheme="majorHAnsi" w:eastAsiaTheme="majorEastAsia" w:hAnsiTheme="majorHAnsi" w:cstheme="majorBidi"/>
       <w:b/>
       <w:bCs/>
       <w:color w:val="1B4FBE"/>

</xml_diff>